<commit_message>
docs: cambiar nomenclatura de Cuenta Familiar a Asociación Apoderado-Alumno
</commit_message>
<xml_diff>
--- a/docs/EduSaldo - Arquitectura de Sistema.docx
+++ b/docs/EduSaldo - Arquitectura de Sistema.docx
@@ -1599,10 +1599,12 @@
         <w:rPr>
           <w:sz w:val="16"/>
           <w:szCs w:val="16"/>
-        </w:rPr>
-      </w:pPr>
-      <w:r>
-        <w:rPr>
+          <w:lang w:val="en-US"/>
+        </w:rPr>
+      </w:pPr>
+      <w:r>
+        <w:rPr>
+          <w:noProof/>
           <w:sz w:val="16"/>
           <w:szCs w:val="16"/>
         </w:rPr>
@@ -1872,7 +1874,7 @@
           <w:sz w:val="20"/>
           <w:szCs w:val="20"/>
         </w:rPr>
-        <w:t>MS Auth y Usuarios ↔ 8082 Alumnos y Saldos: validar cuenta familiar / usuario.</w:t>
+        <w:t>MS Auth y Usuarios ↔ 8082 Alumnos y Saldos: validar cuenta / usuario.</w:t>
       </w:r>
     </w:p>
     <w:p>
@@ -1904,6 +1906,7 @@
       </w:pPr>
       <w:r>
         <w:rPr>
+          <w:noProof/>
           <w:sz w:val="16"/>
           <w:szCs w:val="16"/>
         </w:rPr>
@@ -2100,7 +2103,21 @@
           <w:sz w:val="20"/>
           <w:szCs w:val="20"/>
         </w:rPr>
-        <w:t>Responsabilidad funcional: Importación CSV, Asociación familiar, Saldo actual/reservado/disponible, Abono simulado, Sin saldo negativo, Alerta &lt;= umbral. Base de datos propia: db_alumnos_saldos. Historias relacionadas: HU14-HU23, HU35.</w:t>
+        <w:t xml:space="preserve">Responsabilidad funcional: Importación CSV, Asociación </w:t>
+      </w:r>
+      <w:r>
+        <w:rPr>
+          <w:sz w:val="20"/>
+          <w:szCs w:val="20"/>
+        </w:rPr>
+        <w:t>con apoderados</w:t>
+      </w:r>
+      <w:r>
+        <w:rPr>
+          <w:sz w:val="20"/>
+          <w:szCs w:val="20"/>
+        </w:rPr>
+        <w:t>, Saldo actual/reservado/disponible, Abono simulado, Sin saldo negativo, Alerta &lt;= umbral. Base de datos propia: db_alumnos_saldos. Historias relacionadas: HU14-HU23, HU35.</w:t>
       </w:r>
     </w:p>
     <w:p>
@@ -2188,6 +2205,7 @@
       </w:r>
       <w:r>
         <w:rPr>
+          <w:noProof/>
           <w:sz w:val="20"/>
           <w:szCs w:val="20"/>
         </w:rPr>
@@ -2580,6 +2598,7 @@
       </w:pPr>
       <w:r>
         <w:rPr>
+          <w:noProof/>
           <w:sz w:val="16"/>
           <w:szCs w:val="16"/>
         </w:rPr>
@@ -2913,6 +2932,7 @@
       </w:pPr>
       <w:r>
         <w:rPr>
+          <w:noProof/>
           <w:sz w:val="16"/>
           <w:szCs w:val="16"/>
         </w:rPr>
@@ -3236,6 +3256,7 @@
       </w:pPr>
       <w:r>
         <w:rPr>
+          <w:noProof/>
           <w:sz w:val="16"/>
           <w:szCs w:val="16"/>
         </w:rPr>
@@ -3689,6 +3710,7 @@
       </w:pPr>
       <w:r>
         <w:rPr>
+          <w:noProof/>
           <w:sz w:val="16"/>
           <w:szCs w:val="16"/>
         </w:rPr>

</xml_diff>

<commit_message>
docs: actualizar HU y arquitectura con nombres atomizados, facturas múltiples y devolución de saldo
</commit_message>
<xml_diff>
--- a/docs/EduSaldo - Arquitectura de Sistema.docx
+++ b/docs/EduSaldo - Arquitectura de Sistema.docx
@@ -1858,6 +1858,26 @@
           <w:sz w:val="20"/>
           <w:szCs w:val="20"/>
         </w:rPr>
+        <w:t xml:space="preserve">Datos personales atomizados: primer nombre, segundo nombre (opcional), primer apellido y segundo apellido (opcional).</w:t>
+      </w:r>
+    </w:p>
+    <w:p>
+      <w:pPr>
+        <w:pStyle w:val="ListParagraph"/>
+        <w:numPr>
+          <w:ilvl w:val="0"/>
+          <w:numId w:val="12"/>
+        </w:numPr>
+        <w:rPr>
+          <w:sz w:val="20"/>
+          <w:szCs w:val="20"/>
+        </w:rPr>
+      </w:pPr>
+      <w:r>
+        <w:rPr>
+          <w:sz w:val="20"/>
+          <w:szCs w:val="20"/>
+        </w:rPr>
         <w:t xml:space="preserve">Creación de usuarios Apoderado solo a solicitud de MS Alumnos y Saldos, junto con su asociación a un alumno.</w:t>
       </w:r>
     </w:p>
@@ -2048,7 +2068,7 @@
           <w:sz w:val="20"/>
           <w:szCs w:val="20"/>
         </w:rPr>
-        <w:t>Alumno: RUT, nombre, fecha de nacimiento, curso y estado.</w:t>
+        <w:t xml:space="preserve">Alumno: RUT, primer nombre, segundo nombre (opcional), primer apellido, segundo apellido (opcional), fecha de nacimiento, curso y estado.</w:t>
       </w:r>
     </w:p>
     <w:p>
@@ -2108,7 +2128,7 @@
           <w:sz w:val="20"/>
           <w:szCs w:val="20"/>
         </w:rPr>
-        <w:t>Historial de movimientos: abonos, compras, reservas, devoluciones y ajustes.</w:t>
+        <w:t xml:space="preserve">Historial de movimientos: abonos, compras, reservas, devoluciones de venta, devoluciones de saldo y ajustes.</w:t>
       </w:r>
     </w:p>
     <w:p>
@@ -2128,7 +2148,7 @@
           <w:sz w:val="20"/>
           <w:szCs w:val="20"/>
         </w:rPr>
-        <w:t xml:space="preserve">Alta en un solo paso (alumno + apoderado + asociación). Si falla la creación del usuario en MS Auth, se compensa y no queda ningún registro parcial.</w:t>
+        <w:t xml:space="preserve">Devolución de saldo al retirarse el alumno o cambiarse de colegio: la entrega del dinero es manual, pero el Administrador la registra (apoderado receptor, monto, medio, comprobante y motivo); el saldo queda en cero y el alumno puede inactivarse.</w:t>
       </w:r>
     </w:p>
     <w:p>
@@ -2148,52 +2168,7 @@
           <w:sz w:val="20"/>
           <w:szCs w:val="20"/>
         </w:rPr>
-        <w:t xml:space="preserve">Alerta de saldo bajo con ciclo ACTIVA/RESUELTA, notificada a todos los apoderados con asociación vigente.</w:t>
-      </w:r>
-    </w:p>
-    <w:p>
-      <w:pPr>
-        <w:rPr>
-          <w:sz w:val="20"/>
-          <w:szCs w:val="20"/>
-        </w:rPr>
-      </w:pPr>
-      <w:r>
-        <w:rPr>
-          <w:sz w:val="20"/>
-          <w:szCs w:val="20"/>
-        </w:rPr>
-        <w:t xml:space="preserve">Responsabilidad funcional: Importación CSV, Asociación </w:t>
-      </w:r>
-      <w:r>
-        <w:rPr>
-          <w:sz w:val="20"/>
-          <w:szCs w:val="20"/>
-        </w:rPr>
-        <w:t>con apoderados</w:t>
-      </w:r>
-      <w:r>
-        <w:rPr>
-          <w:sz w:val="20"/>
-          <w:szCs w:val="20"/>
-        </w:rPr>
-        <w:t xml:space="preserve">, Saldo actual/reservado/disponible, Abono simulado, Sin saldo negativo, Alerta &lt;= umbral. Base de datos propia: db_alumnos_saldos. Historias relacionadas: HU14-HU23 (incluye HU15 con ex-HU04 y la nueva HU16), HU35.</w:t>
-      </w:r>
-    </w:p>
-    <w:p>
-      <w:pPr>
-        <w:pStyle w:val="Heading3"/>
-        <w:rPr>
-          <w:sz w:val="22"/>
-          <w:szCs w:val="22"/>
-        </w:rPr>
-      </w:pPr>
-      <w:r>
-        <w:rPr>
-          <w:sz w:val="22"/>
-          <w:szCs w:val="22"/>
-        </w:rPr>
-        <w:t>Integraciones REST</w:t>
+        <w:t xml:space="preserve">Alta en un solo paso (alumno + apoderado + asociación). Si falla la creación del usuario en MS Auth, se compensa y no queda ningún registro parcial.</w:t>
       </w:r>
     </w:p>
     <w:p>
@@ -2213,7 +2188,52 @@
           <w:sz w:val="20"/>
           <w:szCs w:val="20"/>
         </w:rPr>
-        <w:t xml:space="preserve">MS Alumnos y Saldos ↔ 8081 Auth y Usuarios: crear/reutilizar usuario Apoderado (apoderadoId).</w:t>
+        <w:t xml:space="preserve">Alerta de saldo bajo con ciclo ACTIVA/RESUELTA, notificada a todos los apoderados con asociación vigente.</w:t>
+      </w:r>
+    </w:p>
+    <w:p>
+      <w:pPr>
+        <w:rPr>
+          <w:sz w:val="20"/>
+          <w:szCs w:val="20"/>
+        </w:rPr>
+      </w:pPr>
+      <w:r>
+        <w:rPr>
+          <w:sz w:val="20"/>
+          <w:szCs w:val="20"/>
+        </w:rPr>
+        <w:t xml:space="preserve">Responsabilidad funcional: Importación CSV, Asociación </w:t>
+      </w:r>
+      <w:r>
+        <w:rPr>
+          <w:sz w:val="20"/>
+          <w:szCs w:val="20"/>
+        </w:rPr>
+        <w:t>con apoderados</w:t>
+      </w:r>
+      <w:r>
+        <w:rPr>
+          <w:sz w:val="20"/>
+          <w:szCs w:val="20"/>
+        </w:rPr>
+        <w:t xml:space="preserve">, Saldo actual/reservado/disponible, Abono simulado, Sin saldo negativo, Alerta &lt;= umbral. Base de datos propia: db_alumnos_saldos. Historias relacionadas: HU14-HU23 (incluye HU15 con ex-HU04 y la nueva HU16), HU35.</w:t>
+      </w:r>
+    </w:p>
+    <w:p>
+      <w:pPr>
+        <w:pStyle w:val="Heading3"/>
+        <w:rPr>
+          <w:sz w:val="22"/>
+          <w:szCs w:val="22"/>
+        </w:rPr>
+      </w:pPr>
+      <w:r>
+        <w:rPr>
+          <w:sz w:val="22"/>
+          <w:szCs w:val="22"/>
+        </w:rPr>
+        <w:t>Integraciones REST</w:t>
       </w:r>
     </w:p>
     <w:p>
@@ -2233,7 +2253,7 @@
           <w:sz w:val="20"/>
           <w:szCs w:val="20"/>
         </w:rPr>
-        <w:t>MS Alumnos y Saldos ↔ 8084 Ventas y Reservas: reservar/liberar/finalizar saldo.</w:t>
+        <w:t xml:space="preserve">MS Alumnos y Saldos ↔ 8081 Auth y Usuarios: crear/reutilizar usuario Apoderado (apoderadoId).</w:t>
       </w:r>
     </w:p>
     <w:p>
@@ -2253,8 +2273,28 @@
           <w:sz w:val="20"/>
           <w:szCs w:val="20"/>
         </w:rPr>
+        <w:t>MS Alumnos y Saldos ↔ 8084 Ventas y Reservas: reservar/liberar/finalizar saldo.</w:t>
+      </w:r>
+    </w:p>
+    <w:p>
+      <w:pPr>
+        <w:pStyle w:val="ListParagraph"/>
+        <w:numPr>
+          <w:ilvl w:val="0"/>
+          <w:numId w:val="12"/>
+        </w:numPr>
+        <w:rPr>
+          <w:sz w:val="20"/>
+          <w:szCs w:val="20"/>
+        </w:rPr>
+      </w:pPr>
+      <w:r>
+        <w:rPr>
+          <w:sz w:val="20"/>
+          <w:szCs w:val="20"/>
+        </w:rPr>
         <w:lastRenderedPageBreak/>
-        <w:t>MS Alumnos y Saldos ↔ 8086 Finanzas: movimiento por abono.</w:t>
+        <w:t xml:space="preserve">MS Alumnos y Saldos ↔ 8086 Finanzas: ingreso por abono y egreso por devolución de saldo.</w:t>
       </w:r>
       <w:r>
         <w:rPr>
@@ -3197,11 +3237,31 @@
           <w:sz w:val="20"/>
           <w:szCs w:val="20"/>
         </w:rPr>
-        <w:t>Factura asociada a la recepción.</w:t>
+        <w:t xml:space="preserve">Una o más facturas por recepción, cada una con sus líneas de detalle (1 a 60 ítems, límite del SII).</w:t>
       </w:r>
     </w:p>
     <w:p>
       <w:pPr>
+        <w:pStyle w:val="ListParagraph"/>
+        <w:numPr>
+          <w:ilvl w:val="0"/>
+          <w:numId w:val="12"/>
+        </w:numPr>
+        <w:rPr>
+          <w:sz w:val="20"/>
+          <w:szCs w:val="20"/>
+        </w:rPr>
+      </w:pPr>
+      <w:r>
+        <w:rPr>
+          <w:sz w:val="20"/>
+          <w:szCs w:val="20"/>
+        </w:rPr>
+        <w:t xml:space="preserve">Contacto del proveedor con nombre atomizado (primer nombre, segundo nombre, primer apellido, segundo apellido), correo y teléfono.</w:t>
+      </w:r>
+    </w:p>
+    <w:p>
+      <w:pPr>
         <w:rPr>
           <w:sz w:val="20"/>
           <w:szCs w:val="20"/>
@@ -3228,7 +3288,7 @@
           <w:sz w:val="20"/>
           <w:szCs w:val="20"/>
         </w:rPr>
-        <w:t xml:space="preserve">La recepción la realiza el Encargado comparando OC, factura y mercadería física. Solo existen recepciones COMPLETAS o INCOMPLETAS. Si la factura no coincide con la mercadería recibida o contiene artículos no ordenados, la recepción puntual se RECHAZA junto con su factura, sin actualizar el stock ni alterar el CPP; la OC permanece vigente (EMITIDA o RECEPCIÓN_PARCIAL) a la espera de un nuevo despacho corregido.</w:t>
+        <w:t xml:space="preserve">La recepción la realiza el Encargado comparando OC, facturas y mercadería física. Solo existen recepciones COMPLETAS o INCOMPLETAS. Si las facturas no coinciden con la mercadería recibida o contienen artículos no ordenados, la recepción puntual se RECHAZA junto con todas sus facturas, sin actualizar el stock ni alterar el CPP; la OC permanece vigente (EMITIDA o RECEPCIÓN_PARCIAL) a la espera de un nuevo despacho corregido.</w:t>
       </w:r>
     </w:p>
     <w:p>
@@ -3243,7 +3303,7 @@
           <w:sz w:val="20"/>
           <w:szCs w:val="20"/>
         </w:rPr>
-        <w:t xml:space="preserve">Una recepción incompleta es válida cuando la factura coincide exactamente con la parte de la OC que efectivamente llegó. Cada recepción aceptada vincula una única factura; una OC puede tener varias recepciones (entregas parciales), cada una con su factura asociada respaldada por su DetalleRecepcion. Una OC sin recepciones puede cancelarse con motivo obligatorio.</w:t>
+        <w:t xml:space="preserve">Una recepción incompleta es válida cuando la suma de sus facturas coincide exactamente con la parte de la OC que efectivamente llegó. Cada recepción vincula una o más facturas, por ejemplo cuando el proveedor divide la entrega por el límite de 60 ítems del SII. Una OC puede tener varias recepciones (entregas parciales), por lo que puede tener varias facturas; todas referencian la OC. Una OC sin recepciones puede cancelarse con motivo obligatorio.</w:t>
       </w:r>
     </w:p>
     <w:p>
@@ -3451,7 +3511,7 @@
           <w:sz w:val="20"/>
           <w:szCs w:val="20"/>
         </w:rPr>
-        <w:t xml:space="preserve">Cartola de caja: saldo de apertura, abonos, pagos de facturas y saldo actual. Las ventas y devoluciones no mueven caja (consumen saldo ya abonado): se registran como resultados, para evitar la doble contabilización (HU54, HU58).</w:t>
+        <w:t xml:space="preserve">Cartola de caja: saldo de apertura, abonos, pagos de facturas, devoluciones de saldo a apoderados y saldo actual. Las ventas y devoluciones no mueven caja (consumen saldo ya abonado): se registran como resultados, para evitar la doble contabilización (HU54, HU58).</w:t>
       </w:r>
     </w:p>
     <w:p>
@@ -3912,7 +3972,7 @@
           <w:sz w:val="20"/>
           <w:szCs w:val="20"/>
         </w:rPr>
-        <w:t xml:space="preserve">React → Gateway → Compras. El Administrador emite la OC en valores netos con sus líneas de DetalleOrdenCompra. Posteriormente el Encargado recepciona la mercadería con su factura; si la factura no coincide con lo recibido o trae artículos incorrectos, se rechaza la recepción puntual y su factura, manteniendo la OC vigente para una futura entrega subsanada. Si la recepción es válida, Compras solicita a Productos/Inventario el aumento de stock por las unidades aceptadas y el recálculo del CPP utilizando el costo total con IVA incluido.</w:t>
+        <w:t xml:space="preserve">React → Gateway → Compras. El Administrador emite la OC en valores netos con sus líneas de DetalleOrdenCompra. Posteriormente el Encargado recepciona la mercadería con una o más facturas; si las facturas no coinciden con lo recibido o trae artículos incorrectos, se rechaza la recepción puntual con todas sus facturas, manteniendo la OC vigente para una futura entrega subsanada. Si la recepción es válida, Compras solicita a Productos/Inventario el aumento de stock por las unidades aceptadas y el recálculo del CPP utilizando el costo total con IVA incluido.</w:t>
       </w:r>
     </w:p>
     <w:p>

</xml_diff>

<commit_message>
docs: actualizar requerimientos y arquitectura sincronizados con diagramas puml
</commit_message>
<xml_diff>
--- a/docs/EduSaldo - Arquitectura de Sistema.docx
+++ b/docs/EduSaldo - Arquitectura de Sistema.docx
@@ -2938,11 +2938,7 @@
         </w:rPr>
       </w:pPr>
       <w:r>
-        <w:rPr>
-          <w:sz w:val="20"/>
-          <w:szCs w:val="20"/>
-        </w:rPr>
-        <w:t xml:space="preserve">Responsabilidad funcional: Carrito de reserva multilínea, DetalleReserva, DetalleVenta, PENDIENTE, LISTA_PARA_RETIRO, ENTREGADA, CANCELADA, Venta directa, Devolución. Base de datos propia: db_ventas_reservas. Historias relacionadas: HU27-HU37.</w:t>
+        <w:t>Responsabilidad funcional: Carrito de reserva multilínea, DetalleReserva, DetalleVenta, Ciclo de reserva (PENDIENTE → EN_PREPARACION → ETIQUETA_PENDIENTE → LISTA_PARA_RETIRO → ENTREGADA / CANCELADA), Venta presencial directa (alumnos ≥ 12 años), Devolución con motivo justificado. Base de datos propia: db_ventas_reservas. Historias relacionadas: HU27-HU37.</w:t>
       </w:r>
     </w:p>
     <w:p>
@@ -3284,11 +3280,7 @@
         </w:rPr>
       </w:pPr>
       <w:r>
-        <w:rPr>
-          <w:sz w:val="20"/>
-          <w:szCs w:val="20"/>
-        </w:rPr>
-        <w:t xml:space="preserve">La recepción la realiza el Encargado comparando OC, facturas y mercadería física. Solo existen recepciones COMPLETAS o INCOMPLETAS. Si las facturas no coinciden con la mercadería recibida o contienen artículos no ordenados, la recepción puntual se RECHAZA junto con todas sus facturas, sin actualizar el stock ni alterar el CPP; la OC permanece vigente (EMITIDA o RECEPCIÓN_PARCIAL) a la espera de un nuevo despacho corregido.</w:t>
+        <w:t>La recepción la realiza el Encargado comparando OC, facturas y mercadería física. Solo existen recepciones COMPLETAS o INCOMPLETAS. Para auditar artículos no ordenados (HU49 CA3), DetalleFactura captura productoId opcional [0..1], sku y descripcionOriginal. Si las facturas no coinciden con la mercadería recibida o contienen artículos no ordenados, la recepción puntual se RECHAZA en un solo POST atómico junto con todas sus facturas, sin actualizar el stock ni alterar el CPP; la OC permanece vigente (EMITIDA o RECEPCIÓN_PARCIAL) a la espera de un nuevo despacho corregido. La regla de factura única (proveedorId + numero) se valida a nivel de aplicación en backend, permitiendo reusar el número si el intento previo fue RECHAZADA.</w:t>
       </w:r>
     </w:p>
     <w:p>
@@ -3299,11 +3291,7 @@
         </w:rPr>
       </w:pPr>
       <w:r>
-        <w:rPr>
-          <w:sz w:val="20"/>
-          <w:szCs w:val="20"/>
-        </w:rPr>
-        <w:t xml:space="preserve">Una recepción incompleta es válida cuando la suma de sus facturas coincide exactamente con la parte de la OC que efectivamente llegó. Cada recepción vincula una o más facturas, por ejemplo cuando el proveedor divide la entrega por el límite de 60 ítems del SII. Una OC puede tener varias recepciones (entregas parciales), por lo que puede tener varias facturas; todas referencian la OC. Una OC sin recepciones puede cancelarse con motivo obligatorio.</w:t>
+        <w:t>Una recepción incompleta es válida cuando la suma de sus facturas coincide exactamente con la parte de la OC que efectivamente llegó. Cada recepción vincula una o más facturas (ej. por el límite de 60 ítems del SII). Se elimina el ciclo ORM directo Factura → OrdenCompra: se vinculan jerárquicamente a través de Recepción. Todos los montos financieros operan bajo tipos Long para prevenir desbordamientos en moneda chilena. El costo unitario enviado a Inventario para el CPP promedia el valor real facturado con IVA (redondeado a Long), descartando el precio estimado de la OC. La factura adquiere el estado PAGADA cuando Finanzas notifica la liquidación del egreso.</w:t>
       </w:r>
     </w:p>
     <w:p>
@@ -3314,11 +3302,7 @@
         </w:rPr>
       </w:pPr>
       <w:r>
-        <w:rPr>
-          <w:sz w:val="20"/>
-          <w:szCs w:val="20"/>
-        </w:rPr>
-        <w:t xml:space="preserve">Responsabilidad funcional: Proveedores, OC, Recepción parcial/total, Rechazo diferencias, Factura por recepción, Costo efectivo con IVA. Base de datos propia: db_compras. Historias relacionadas: HU46-HU49 (HU49 incluye ex-HU50 y ex-HU53).</w:t>
+        <w:t>Responsabilidad funcional: Proveedores, OC en neto, Recepción atómica parcial/total, Rechazo con auditoría de intrusos, Factura por recepción con límite de 60 líneas, Costo real con IVA promediado (Long), Ciclo de factura (ACEPTADA, RECHAZADA, PAGADA). Base de datos propia: db_compras. Historias relacionadas: HU46-HU49.</w:t>
       </w:r>
     </w:p>
     <w:p>
@@ -3360,11 +3344,7 @@
         </w:rPr>
       </w:pPr>
       <w:r>
-        <w:rPr>
-          <w:sz w:val="20"/>
-          <w:szCs w:val="20"/>
-        </w:rPr>
-        <w:t>MS Compras ↔ 8086 Finanzas: solicitud/pago factura.</w:t>
+        <w:t>MS Compras ↔ 8086 Finanzas: solicitud/pago factura y notificación de factura PAGADA tras doble firma.</w:t>
       </w:r>
     </w:p>
     <w:p>
@@ -3662,11 +3642,7 @@
         </w:rPr>
       </w:pPr>
       <w:r>
-        <w:rPr>
-          <w:sz w:val="20"/>
-          <w:szCs w:val="20"/>
-        </w:rPr>
-        <w:t>No se admitirán pagos parciales de facturas. Una factura aceptada se paga completa. El detalle del pago mostrará qué productos y cantidades recibidas de la OC respaldan la factura.</w:t>
+        <w:t>No se admitirán pagos parciales de facturas. Una factura aceptada se paga completa. ItemFacturaPorPagar actúa como proyección de lectura en db_finanzas_config para que el Autorizador audite los productos recibidos que respaldan el pago de forma autónoma. Al completarse el pago con doble firma, Finanzas registra el egreso automático en Cuenta Librería y notifica a MS Compras para cambiar el estado de la factura a PAGADA.</w:t>
       </w:r>
     </w:p>
     <w:p>
@@ -3968,11 +3944,7 @@
         </w:rPr>
       </w:pPr>
       <w:r>
-        <w:rPr>
-          <w:sz w:val="20"/>
-          <w:szCs w:val="20"/>
-        </w:rPr>
-        <w:t xml:space="preserve">React → Gateway → Compras. El Administrador emite la OC en valores netos con sus líneas de DetalleOrdenCompra. Posteriormente el Encargado recepciona la mercadería con una o más facturas; si las facturas no coinciden con lo recibido o trae artículos incorrectos, se rechaza la recepción puntual con todas sus facturas, manteniendo la OC vigente para una futura entrega subsanada. Si la recepción es válida, Compras solicita a Productos/Inventario el aumento de stock por las unidades aceptadas y el recálculo del CPP utilizando el costo total con IVA incluido.</w:t>
+        <w:t>React → Gateway → Compras. El Administrador emite la OC en valores netos con sus líneas de DetalleOrdenCompra. Posteriormente el Encargado recepciona la mercadería con una o más facturas en un solo POST atómico. Si las facturas no coinciden o traen artículos no ordenados, se auditan en DetalleFactura (con productoId opcional y descripción) y se rechaza la recepción puntual con todas sus facturas, manteniendo la OC vigente. Si la recepción es válida, Compras envía a Productos/Inventario el aumento de stock físico y el recálculo del CPP utilizando el promedio real facturado con IVA incluido en Long.</w:t>
       </w:r>
     </w:p>
     <w:p>
@@ -3999,11 +3971,7 @@
         </w:rPr>
       </w:pPr>
       <w:r>
-        <w:rPr>
-          <w:sz w:val="20"/>
-          <w:szCs w:val="20"/>
-        </w:rPr>
-        <w:t>La factura válida pasa desde Compras a Finanzas/Configuración como pendiente de pago. El Administrador solicita el pago y el Autorizador revisa y aprueba o rechaza. Si se aprueba, la factura queda pagada y se genera automáticamente el egreso correspondiente en la Cuenta Librería.</w:t>
+        <w:t>La factura aceptada pasa desde Compras a Finanzas/Configuración como FacturaPorPagar (con su proyección de ítems recibidos). El Administrador solicita el pago y el Autorizador revisa el detalle y aprueba o rechaza (segunda firma). Si se aprueba, se registra el pago, se genera automáticamente el egreso en la Cuenta Librería, y Finanzas notifica a Compras para que la factura pase al estado PAGADA.</w:t>
       </w:r>
     </w:p>
     <w:p>

</xml_diff>

<commit_message>
docs: formalizar catalogo de endpoints rest oficiales en arquitectura
</commit_message>
<xml_diff>
--- a/docs/EduSaldo - Arquitectura de Sistema.docx
+++ b/docs/EduSaldo - Arquitectura de Sistema.docx
@@ -4366,25 +4366,19 @@
         </w:rPr>
       </w:pPr>
       <w:r>
-        <w:rPr>
-          <w:sz w:val="20"/>
-          <w:szCs w:val="20"/>
-        </w:rPr>
-        <w:t>3. Definir endpoints REST necesarios para reproducir los procesos del prototip</w:t>
-      </w:r>
-      <w:r>
-        <w:rPr>
-          <w:sz w:val="20"/>
-          <w:szCs w:val="20"/>
-        </w:rPr>
-        <w:t>o</w:t>
-      </w:r>
-      <w:r>
-        <w:rPr>
-          <w:sz w:val="20"/>
-          <w:szCs w:val="20"/>
-        </w:rPr>
-        <w:t>.</w:t>
+        <w:t>3. Endpoints REST oficiales implementados y documentados en OpenAPI 3.0 / Swagger en cada puerto:</w:t>
+        <w:br/>
+        <w:t xml:space="preserve">   • 8081 Auth: POST /api/auth/login, POST /api/usuarios, PUT /api/usuarios/{id}/password, PUT /api/usuarios/{id}/inactivar</w:t>
+        <w:br/>
+        <w:t xml:space="preserve">   • 8082 Alumnos: GET/POST /api/alumnos, POST /api/saldos/{id}/abonar, POST /api/saldos/{id}/comprometer, POST /api/saldos/{id}/finalizar-reserva</w:t>
+        <w:br/>
+        <w:t xml:space="preserve">   • 8083 Productos: GET/POST /api/productos, POST /api/inventario/{id}/reservar, POST /api/inventario/{id}/descontar, POST /api/inventario/{id}/entrada-compra, POST/PUT /api/inventario/ajustes/**</w:t>
+        <w:br/>
+        <w:t xml:space="preserve">   • 8084 Ventas: POST /api/reservas, PUT /api/reservas/{id}/iniciar-preparacion, PUT /api/reservas/{id}/etiquetar, POST /api/reservas/{id}/entregar, POST /api/ventas/directa</w:t>
+        <w:br/>
+        <w:t xml:space="preserve">   • 8085 Compras: GET/POST /api/proveedores, POST /api/ordenes-compra, POST /api/recepciones (Variante B atómica), PUT /api/recepciones/facturas/{id}/marcar-pagada</w:t>
+        <w:br/>
+        <w:t xml:space="preserve">   • 8086 Finanzas: GET/POST /api/finanzas/caja/** (HU58), POST /api/finanzas/resultados/operacion, POST/PUT /api/finanzas/pagos/** (doble firma), POST /api/periodos/abrir</w:t>
       </w:r>
     </w:p>
     <w:p>

</xml_diff>

<commit_message>
docs(arquitectura): actualizar a 4 microservicios y sincronizar con requerimientos
</commit_message>
<xml_diff>
--- a/docs/EduSaldo - Arquitectura de Sistema.docx
+++ b/docs/EduSaldo - Arquitectura de Sistema.docx
@@ -80,25 +80,7 @@
         </w:rPr>
       </w:pPr>
       <w:r>
-        <w:rPr>
-          <w:sz w:val="20"/>
-          <w:szCs w:val="20"/>
-        </w:rPr>
-        <w:t xml:space="preserve">La arquitectura se compone de seis microservicios de negocio más un API Gateway como punto único de entrada. Esta distribución garantiza una separación clara de responsabilidades por dominios (Domain-Driven Design), asegurando alta cohesión y bajo acoplamiento sin incurrir en una </w:t>
-      </w:r>
-      <w:r>
-        <w:rPr>
-          <w:sz w:val="20"/>
-          <w:szCs w:val="20"/>
-        </w:rPr>
-        <w:t>sobre fragmentación</w:t>
-      </w:r>
-      <w:r>
-        <w:rPr>
-          <w:sz w:val="20"/>
-          <w:szCs w:val="20"/>
-        </w:rPr>
-        <w:t xml:space="preserve"> de proyectos.</w:t>
+        <w:t>La arquitectura se compone de cuatro microservicios de negocio más un API Gateway como punto único de entrada. Esta distribución garantiza una separación clara de responsabilidades por dominios (Domain-Driven Design), asegurando alta cohesión y bajo acoplamiento sin incurrir en una sobre fragmentación de proyectos.</w:t>
       </w:r>
     </w:p>
     <w:p>
@@ -1095,18 +1077,8 @@
             <w:vAlign w:val="center"/>
           </w:tcPr>
           <w:p>
-            <w:pPr>
-              <w:rPr>
-                <w:sz w:val="20"/>
-                <w:szCs w:val="20"/>
-              </w:rPr>
-            </w:pPr>
             <w:r>
-              <w:rPr>
-                <w:sz w:val="20"/>
-                <w:szCs w:val="20"/>
-              </w:rPr>
-              <w:t>Auth y Usuarios</w:t>
+              <w:t>Usuarios y Auth</w:t>
             </w:r>
           </w:p>
         </w:tc>
@@ -1115,18 +1087,8 @@
             <w:tcW w:w="2375" w:type="dxa"/>
           </w:tcPr>
           <w:p>
-            <w:pPr>
-              <w:rPr>
-                <w:sz w:val="20"/>
-                <w:szCs w:val="20"/>
-              </w:rPr>
-            </w:pPr>
             <w:r>
-              <w:rPr>
-                <w:sz w:val="20"/>
-                <w:szCs w:val="20"/>
-              </w:rPr>
-              <w:t>db_auth_usuarios</w:t>
+              <w:t>db_usuarios</w:t>
             </w:r>
           </w:p>
         </w:tc>
@@ -1136,18 +1098,8 @@
             <w:vAlign w:val="center"/>
           </w:tcPr>
           <w:p>
-            <w:pPr>
-              <w:rPr>
-                <w:sz w:val="20"/>
-                <w:szCs w:val="20"/>
-              </w:rPr>
-            </w:pPr>
             <w:r>
-              <w:rPr>
-                <w:sz w:val="20"/>
-                <w:szCs w:val="20"/>
-              </w:rPr>
-              <w:t xml:space="preserve">Login, autenticación, usuarios y roles: Apoderado, Encargado, Administrador y Autorizador.</w:t>
+              <w:t>Login JWT, usuarios polimórficos (Administrador, Encargado, Apoderado, Alumno), relación Apoderado-Alumno, configuración institucional, parámetros y auditoría.</w:t>
             </w:r>
           </w:p>
         </w:tc>
@@ -1180,18 +1132,8 @@
             <w:vAlign w:val="center"/>
           </w:tcPr>
           <w:p>
-            <w:pPr>
-              <w:rPr>
-                <w:sz w:val="20"/>
-                <w:szCs w:val="20"/>
-              </w:rPr>
-            </w:pPr>
             <w:r>
-              <w:rPr>
-                <w:sz w:val="20"/>
-                <w:szCs w:val="20"/>
-              </w:rPr>
-              <w:t>Alumnos y Saldos</w:t>
+              <w:t>Saldos y Abonos</w:t>
             </w:r>
           </w:p>
         </w:tc>
@@ -1200,18 +1142,8 @@
             <w:tcW w:w="2375" w:type="dxa"/>
           </w:tcPr>
           <w:p>
-            <w:pPr>
-              <w:rPr>
-                <w:sz w:val="20"/>
-                <w:szCs w:val="20"/>
-              </w:rPr>
-            </w:pPr>
             <w:r>
-              <w:rPr>
-                <w:sz w:val="20"/>
-                <w:szCs w:val="20"/>
-              </w:rPr>
-              <w:t>db_alumnos_saldos</w:t>
+              <w:t>db_saldos</w:t>
             </w:r>
           </w:p>
         </w:tc>
@@ -1221,18 +1153,8 @@
             <w:vAlign w:val="center"/>
           </w:tcPr>
           <w:p>
-            <w:pPr>
-              <w:rPr>
-                <w:sz w:val="20"/>
-                <w:szCs w:val="20"/>
-              </w:rPr>
-            </w:pPr>
             <w:r>
-              <w:rPr>
-                <w:sz w:val="20"/>
-                <w:szCs w:val="20"/>
-              </w:rPr>
-              <w:t>Alumnos, relación apoderado-alumno, saldo disponible y movimientos de saldo.</w:t>
+              <w:t>Cuentas de saldo por alumno, invariante de saldo, abonos Webpay simulados con bloqueo temporal y movimientos de saldo.</w:t>
             </w:r>
           </w:p>
         </w:tc>
@@ -1265,17 +1187,7 @@
             <w:vAlign w:val="center"/>
           </w:tcPr>
           <w:p>
-            <w:pPr>
-              <w:rPr>
-                <w:sz w:val="20"/>
-                <w:szCs w:val="20"/>
-              </w:rPr>
-            </w:pPr>
             <w:r>
-              <w:rPr>
-                <w:sz w:val="20"/>
-                <w:szCs w:val="20"/>
-              </w:rPr>
               <w:t>Productos e Inventario</w:t>
             </w:r>
           </w:p>
@@ -1285,18 +1197,8 @@
             <w:tcW w:w="2375" w:type="dxa"/>
           </w:tcPr>
           <w:p>
-            <w:pPr>
-              <w:rPr>
-                <w:sz w:val="20"/>
-                <w:szCs w:val="20"/>
-              </w:rPr>
-            </w:pPr>
             <w:r>
-              <w:rPr>
-                <w:sz w:val="20"/>
-                <w:szCs w:val="20"/>
-              </w:rPr>
-              <w:t>db_productos_inventario</w:t>
+              <w:t>db_inventario</w:t>
             </w:r>
           </w:p>
         </w:tc>
@@ -1306,18 +1208,8 @@
             <w:vAlign w:val="center"/>
           </w:tcPr>
           <w:p>
-            <w:pPr>
-              <w:rPr>
-                <w:sz w:val="20"/>
-                <w:szCs w:val="20"/>
-              </w:rPr>
-            </w:pPr>
             <w:r>
-              <w:rPr>
-                <w:sz w:val="20"/>
-                <w:szCs w:val="20"/>
-              </w:rPr>
-              <w:t>Productos, SKU, categorías, stock, CPP, stock crítico, ajustes e inventarios físicos.</w:t>
+              <w:t>Catálogo, categorías, stock físico/reservado/disponible, stock crítico, ingreso manual de stock y ajustes aprobados por Administrador.</w:t>
             </w:r>
           </w:p>
         </w:tc>
@@ -1350,18 +1242,8 @@
             <w:vAlign w:val="center"/>
           </w:tcPr>
           <w:p>
-            <w:pPr>
-              <w:rPr>
-                <w:sz w:val="20"/>
-                <w:szCs w:val="20"/>
-              </w:rPr>
-            </w:pPr>
             <w:r>
-              <w:rPr>
-                <w:sz w:val="20"/>
-                <w:szCs w:val="20"/>
-              </w:rPr>
-              <w:t>Ventas y Reservas</w:t>
+              <w:t>Reservas y Entregas</w:t>
             </w:r>
           </w:p>
         </w:tc>
@@ -1370,18 +1252,8 @@
             <w:tcW w:w="2375" w:type="dxa"/>
           </w:tcPr>
           <w:p>
-            <w:pPr>
-              <w:rPr>
-                <w:sz w:val="20"/>
-                <w:szCs w:val="20"/>
-              </w:rPr>
-            </w:pPr>
             <w:r>
-              <w:rPr>
-                <w:sz w:val="20"/>
-                <w:szCs w:val="20"/>
-              </w:rPr>
-              <w:t>db_ventas_reservas</w:t>
+              <w:t>db_reservas</w:t>
             </w:r>
           </w:p>
         </w:tc>
@@ -1391,188 +1263,8 @@
             <w:vAlign w:val="center"/>
           </w:tcPr>
           <w:p>
-            <w:pPr>
-              <w:rPr>
-                <w:sz w:val="20"/>
-                <w:szCs w:val="20"/>
-              </w:rPr>
-            </w:pPr>
             <w:r>
-              <w:rPr>
-                <w:sz w:val="20"/>
-                <w:szCs w:val="20"/>
-              </w:rPr>
-              <w:t>Reservas, entrega directa, ventas y devoluciones.</w:t>
-            </w:r>
-          </w:p>
-        </w:tc>
-      </w:tr>
-      <w:tr>
-        <w:tc>
-          <w:tcPr>
-            <w:tcW w:w="794" w:type="dxa"/>
-            <w:vAlign w:val="center"/>
-          </w:tcPr>
-          <w:p>
-            <w:pPr>
-              <w:rPr>
-                <w:sz w:val="20"/>
-                <w:szCs w:val="20"/>
-              </w:rPr>
-            </w:pPr>
-            <w:r>
-              <w:rPr>
-                <w:sz w:val="20"/>
-                <w:szCs w:val="20"/>
-              </w:rPr>
-              <w:t>8085</w:t>
-            </w:r>
-          </w:p>
-        </w:tc>
-        <w:tc>
-          <w:tcPr>
-            <w:tcW w:w="1378" w:type="dxa"/>
-            <w:vAlign w:val="center"/>
-          </w:tcPr>
-          <w:p>
-            <w:pPr>
-              <w:rPr>
-                <w:sz w:val="20"/>
-                <w:szCs w:val="20"/>
-              </w:rPr>
-            </w:pPr>
-            <w:r>
-              <w:rPr>
-                <w:sz w:val="20"/>
-                <w:szCs w:val="20"/>
-              </w:rPr>
-              <w:t>Compras</w:t>
-            </w:r>
-          </w:p>
-        </w:tc>
-        <w:tc>
-          <w:tcPr>
-            <w:tcW w:w="2375" w:type="dxa"/>
-          </w:tcPr>
-          <w:p>
-            <w:pPr>
-              <w:rPr>
-                <w:sz w:val="20"/>
-                <w:szCs w:val="20"/>
-              </w:rPr>
-            </w:pPr>
-            <w:r>
-              <w:rPr>
-                <w:sz w:val="20"/>
-                <w:szCs w:val="20"/>
-              </w:rPr>
-              <w:t>db_compras</w:t>
-            </w:r>
-          </w:p>
-        </w:tc>
-        <w:tc>
-          <w:tcPr>
-            <w:tcW w:w="5911" w:type="dxa"/>
-            <w:vAlign w:val="center"/>
-          </w:tcPr>
-          <w:p>
-            <w:pPr>
-              <w:rPr>
-                <w:sz w:val="20"/>
-                <w:szCs w:val="20"/>
-              </w:rPr>
-            </w:pPr>
-            <w:r>
-              <w:rPr>
-                <w:sz w:val="20"/>
-                <w:szCs w:val="20"/>
-              </w:rPr>
-              <w:t>Proveedores, órdenes de compra, recepción de mercadería y facturas.</w:t>
-            </w:r>
-          </w:p>
-        </w:tc>
-      </w:tr>
-      <w:tr>
-        <w:tc>
-          <w:tcPr>
-            <w:tcW w:w="794" w:type="dxa"/>
-            <w:vAlign w:val="center"/>
-          </w:tcPr>
-          <w:p>
-            <w:pPr>
-              <w:rPr>
-                <w:sz w:val="20"/>
-                <w:szCs w:val="20"/>
-              </w:rPr>
-            </w:pPr>
-            <w:r>
-              <w:rPr>
-                <w:sz w:val="20"/>
-                <w:szCs w:val="20"/>
-              </w:rPr>
-              <w:t>8086</w:t>
-            </w:r>
-          </w:p>
-        </w:tc>
-        <w:tc>
-          <w:tcPr>
-            <w:tcW w:w="1378" w:type="dxa"/>
-            <w:vAlign w:val="center"/>
-          </w:tcPr>
-          <w:p>
-            <w:pPr>
-              <w:rPr>
-                <w:sz w:val="20"/>
-                <w:szCs w:val="20"/>
-              </w:rPr>
-            </w:pPr>
-            <w:r>
-              <w:rPr>
-                <w:sz w:val="20"/>
-                <w:szCs w:val="20"/>
-              </w:rPr>
-              <w:t>Finanzas y Configuración</w:t>
-            </w:r>
-          </w:p>
-        </w:tc>
-        <w:tc>
-          <w:tcPr>
-            <w:tcW w:w="2375" w:type="dxa"/>
-          </w:tcPr>
-          <w:p>
-            <w:pPr>
-              <w:rPr>
-                <w:sz w:val="20"/>
-                <w:szCs w:val="20"/>
-              </w:rPr>
-            </w:pPr>
-            <w:r>
-              <w:rPr>
-                <w:sz w:val="20"/>
-                <w:szCs w:val="20"/>
-              </w:rPr>
-              <w:t>db_finanzas_config</w:t>
-            </w:r>
-          </w:p>
-        </w:tc>
-        <w:tc>
-          <w:tcPr>
-            <w:tcW w:w="5911" w:type="dxa"/>
-            <w:vAlign w:val="center"/>
-          </w:tcPr>
-          <w:p>
-            <w:pPr>
-              <w:rPr>
-                <w:sz w:val="20"/>
-                <w:szCs w:val="20"/>
-              </w:rPr>
-            </w:pPr>
-            <w:r>
-              <w:rPr>
-                <w:sz w:val="20"/>
-                <w:szCs w:val="20"/>
-              </w:rPr>
-              <w:t>Cuenta Librería, pagos, autorizaciones, resultados y configuración institucional.</w:t>
+              <w:t>Reservas con trazabilidad (HU31 CA2), entregas presenciales en mesón, devoluciones y notificación por correo a apoderados.</w:t>
             </w:r>
           </w:p>
         </w:tc>
@@ -1709,25 +1401,7 @@
         </w:rPr>
       </w:pPr>
       <w:r>
-        <w:rPr>
-          <w:sz w:val="20"/>
-          <w:szCs w:val="20"/>
-        </w:rPr>
-        <w:t xml:space="preserve">Gestionará la autenticación y los usuarios que operan EduSaldo. Los roles serán APODERADO, ENCARGADO, ADMINISTRADOR y AUTORIZADOR. El Autorizador corresponde al segundo administrador definido en el prototipo: puede consultar la Cuenta Librería y actuar solamente cuando se requiere segunda firma, por </w:t>
-      </w:r>
-      <w:r>
-        <w:rPr>
-          <w:sz w:val="20"/>
-          <w:szCs w:val="20"/>
-        </w:rPr>
-        <w:t>ejemplo,</w:t>
-      </w:r>
-      <w:r>
-        <w:rPr>
-          <w:sz w:val="20"/>
-          <w:szCs w:val="20"/>
-        </w:rPr>
-        <w:t xml:space="preserve"> en pagos y ajustes de stock.</w:t>
+        <w:t>Gestionará la autenticación y los usuarios que operan EduSaldo. Los roles serán ADMINISTRADOR, ENCARGADO, APODERADO y ALUMNO (con inicio de sesión para alumnos ≥ 12 años). El Administrador concentra la gestión de usuarios, autorizaciones del sistema (como ajustes de stock) y la administración de parámetros institucionales y auditoría.</w:t>
       </w:r>
     </w:p>
     <w:p>
@@ -1738,11 +1412,7 @@
         </w:rPr>
       </w:pPr>
       <w:r>
-        <w:rPr>
-          <w:sz w:val="20"/>
-          <w:szCs w:val="20"/>
-        </w:rPr>
-        <w:t xml:space="preserve">Responsabilidad funcional: Login / JWT, Roles y permisos, PRIMER_ACCESO, Bloqueo 5 intentos, Recuperación / reset, Inactivar / reactivar. Base de datos propia: db_auth_usuarios. Historias relacionadas: HU05-HU13, HU68, HU69.</w:t>
+        <w:t>Responsabilidad funcional: Login / JWT, Roles polimórficos, PRIMER_ACCESO, Bloqueo dinámico por política de acceso, Recuperación / reset de contraseñas, Inactivar / reactivar, Configuración institucional, Parámetros y Auditoría. Base de datos propia: db_usuarios. Historias relacionadas: HU01-HU19, HU50-HU56.</w:t>
       </w:r>
     </w:p>
     <w:p>
@@ -1910,11 +1580,7 @@
         </w:rPr>
       </w:pPr>
       <w:r>
-        <w:rPr>
-          <w:sz w:val="20"/>
-          <w:szCs w:val="20"/>
-        </w:rPr>
-        <w:t>MS Auth y Usuarios ↔ 8082 Alumnos y Saldos: validar cuenta / usuario.</w:t>
+        <w:t>MS Usuarios y Auth ↔ 8099 API Gateway: validación de identidad, emisión de JWT y verificación de permisos por rol.</w:t>
       </w:r>
     </w:p>
     <w:p>
@@ -2022,11 +1688,7 @@
         </w:rPr>
       </w:pPr>
       <w:r>
-        <w:rPr>
-          <w:sz w:val="24"/>
-          <w:szCs w:val="24"/>
-        </w:rPr>
-        <w:t>3.2. MS Alumnos y Saldos - Puerto 8082</w:t>
+        <w:t>3.2. MS Saldos y Abonos - Puerto 8082</w:t>
       </w:r>
     </w:p>
     <w:p>
@@ -2184,11 +1846,7 @@
         </w:rPr>
       </w:pPr>
       <w:r>
-        <w:rPr>
-          <w:sz w:val="20"/>
-          <w:szCs w:val="20"/>
-        </w:rPr>
-        <w:t xml:space="preserve">Alerta de saldo bajo con ciclo ACTIVA/RESUELTA, notificada a todos los apoderados con asociación vigente.</w:t>
+        <w:t>Alerta de saldo bajo evaluada dinámicamente mediante regla cruzoUmbralSaldoBajo() tras cada cobro, notificando a los apoderados vinculados sin requerir tabla persistente de alertas.</w:t>
       </w:r>
     </w:p>
     <w:p>
@@ -2199,25 +1857,7 @@
         </w:rPr>
       </w:pPr>
       <w:r>
-        <w:rPr>
-          <w:sz w:val="20"/>
-          <w:szCs w:val="20"/>
-        </w:rPr>
-        <w:t xml:space="preserve">Responsabilidad funcional: Importación CSV, Asociación </w:t>
-      </w:r>
-      <w:r>
-        <w:rPr>
-          <w:sz w:val="20"/>
-          <w:szCs w:val="20"/>
-        </w:rPr>
-        <w:t>con apoderados</w:t>
-      </w:r>
-      <w:r>
-        <w:rPr>
-          <w:sz w:val="20"/>
-          <w:szCs w:val="20"/>
-        </w:rPr>
-        <w:t xml:space="preserve">, Saldo actual/reservado/disponible, Abono simulado, Sin saldo negativo, Alerta &lt;= umbral. Base de datos propia: db_alumnos_saldos. Historias relacionadas: HU14-HU23 (incluye HU15 con ex-HU04 y la nueva HU16), HU35.</w:t>
+        <w:t>Responsabilidad funcional: Cuentas de saldo por alumno, Invariante de saldo (saldoDisponible &gt;= 0), Abonos con pasarela simulada, token y bloqueo temporal, Liquidación de saldo por retiro del alumno y libro mayor inmutable de MovimientoSaldo. Base de datos propia: db_saldos. Historias relacionadas: HU20-HU23.</w:t>
       </w:r>
     </w:p>
     <w:p>
@@ -2289,70 +1929,7 @@
         </w:rPr>
       </w:pPr>
       <w:r>
-        <w:rPr>
-          <w:sz w:val="20"/>
-          <w:szCs w:val="20"/>
-        </w:rPr>
-        <w:lastRenderedPageBreak/>
-        <w:t xml:space="preserve">MS Alumnos y Saldos ↔ 8086 Finanzas: ingreso por abono y egreso por devolución de saldo.</w:t>
-      </w:r>
-      <w:r>
-        <w:rPr>
-          <w:sz w:val="20"/>
-          <w:szCs w:val="20"/>
-        </w:rPr>
-        <w:br/>
-      </w:r>
-      <w:r>
-        <w:rPr>
-          <w:noProof/>
-          <w:sz w:val="20"/>
-          <w:szCs w:val="20"/>
-        </w:rPr>
-        <w:drawing>
-          <wp:inline distT="0" distB="0" distL="0" distR="0" wp14:anchorId="315FD6ED" wp14:editId="7345CC9D">
-            <wp:extent cx="5064708" cy="5149787"/>
-            <wp:effectExtent l="0" t="0" r="3175" b="0"/>
-            <wp:docPr id="3" name="Picture 3"/>
-            <wp:cNvGraphicFramePr>
-              <a:graphicFrameLocks xmlns:a="http://schemas.openxmlformats.org/drawingml/2006/main" noChangeAspect="1"/>
-            </wp:cNvGraphicFramePr>
-            <a:graphic xmlns:a="http://schemas.openxmlformats.org/drawingml/2006/main">
-              <a:graphicData uri="http://schemas.openxmlformats.org/drawingml/2006/picture">
-                <pic:pic xmlns:pic="http://schemas.openxmlformats.org/drawingml/2006/picture">
-                  <pic:nvPicPr>
-                    <pic:cNvPr id="0" name="02_MS_Alumnos_y_Saldos.png"/>
-                    <pic:cNvPicPr/>
-                  </pic:nvPicPr>
-                  <pic:blipFill rotWithShape="1">
-                    <a:blip r:embed="rId8"/>
-                    <a:srcRect l="2236" t="2901" r="1972" b="2297"/>
-                    <a:stretch>
-                      <a:fillRect/>
-                    </a:stretch>
-                  </pic:blipFill>
-                  <pic:spPr bwMode="auto">
-                    <a:xfrm>
-                      <a:off x="0" y="0"/>
-                      <a:ext cx="5072993" cy="5158211"/>
-                    </a:xfrm>
-                    <a:prstGeom prst="rect">
-                      <a:avLst/>
-                    </a:prstGeom>
-                    <a:ln>
-                      <a:noFill/>
-                    </a:ln>
-                    <a:extLst>
-                      <a:ext uri="{53640926-AAD7-44D8-BBD7-CCE9431645EC}">
-                        <a14:shadowObscured xmlns:a14="http://schemas.microsoft.com/office/drawing/2010/main"/>
-                      </a:ext>
-                    </a:extLst>
-                  </pic:spPr>
-                </pic:pic>
-              </a:graphicData>
-            </a:graphic>
-          </wp:inline>
-        </w:drawing>
+        <w:t>MS Saldos y Abonos ↔ 8099 API Gateway: consulta de saldo y acreditación/retención/cobro orquestado vía Gateway.</w:t>
       </w:r>
     </w:p>
     <w:p>
@@ -2515,11 +2092,7 @@
         </w:rPr>
       </w:pPr>
       <w:r>
-        <w:rPr>
-          <w:sz w:val="20"/>
-          <w:szCs w:val="20"/>
-        </w:rPr>
-        <w:t xml:space="preserve">Ajustes de stock: el Encargado reporta la diferencia, el Administrador crea la solicitud y el Autorizador la aprueba o rechaza (doble firma).</w:t>
+        <w:t>Ajustes de stock: el Encargado detecta la diferencia y solicita el ajuste (SolicitudAjusteStock); el Administrador revisa y aprueba o rechaza la solicitud de ajuste. Al aprobarse, se actualiza el stock físico y se genera el MovimientoInventario.</w:t>
       </w:r>
     </w:p>
     <w:p>
@@ -2535,11 +2108,7 @@
         </w:rPr>
       </w:pPr>
       <w:r>
-        <w:rPr>
-          <w:sz w:val="20"/>
-          <w:szCs w:val="20"/>
-        </w:rPr>
-        <w:t>Inventarios físicos e historial con respaldo.</w:t>
+        <w:t>Ingreso manual de stock: el Encargado registra recepciones físicas de mercadería mediante IngresoStock y DetalleIngresoStock (con proveedor y documento de referencia como texto libre opcional).</w:t>
       </w:r>
     </w:p>
     <w:p>
@@ -2555,11 +2124,7 @@
         </w:rPr>
       </w:pPr>
       <w:r>
-        <w:rPr>
-          <w:sz w:val="20"/>
-          <w:szCs w:val="20"/>
-        </w:rPr>
-        <w:t>Costo Promedio Ponderado (CPP).</w:t>
+        <w:t>Trazabilidad completa mediante MovimientoInventario para los 6 tipos (INGRESO, RESERVA, LIBERACION, ENTREGA, DEVOLUCION, AJUSTE).</w:t>
       </w:r>
     </w:p>
     <w:p>
@@ -2590,11 +2155,7 @@
         </w:rPr>
       </w:pPr>
       <w:r>
-        <w:rPr>
-          <w:sz w:val="20"/>
-          <w:szCs w:val="20"/>
-        </w:rPr>
-        <w:t>Regla de valorización: el Centro General no utiliza el IVA como crédito fiscal; por lo tanto, el costo de inventario y el CPP se calcularán utilizando el costo total de compra con IVA incluido.</w:t>
+        <w:t>Precios y montos operan estrictamente en valores enteros (int en CLP) para compatibilidad con la moneda nacional y simplicidad operativa.</w:t>
       </w:r>
     </w:p>
     <w:p>
@@ -2605,11 +2166,7 @@
         </w:rPr>
       </w:pPr>
       <w:r>
-        <w:rPr>
-          <w:sz w:val="20"/>
-          <w:szCs w:val="20"/>
-        </w:rPr>
-        <w:t>Responsabilidad funcional: CRUD producto/categoría, Stock físico/reservado/disponible, Reserva/liberación stock, Inventario físico, Ajuste con 2da firma, Stock crítico, CPP y valorización. Base de datos propia: db_productos_inventario. Historias relacionadas: HU24-HU26, HU38-HU45, HU51-HU52, HU60.</w:t>
+        <w:t>Responsabilidad funcional: CRUD producto/categoría, Stock físico/reservado/disponible, Invariante de stock (stockDisponible &gt;= 0), Ingreso manual de stock, Solicitudes de ajuste de stock y MovimientoInventario. Base de datos propia: db_inventario. Historias relacionadas: HU38-HU46.</w:t>
       </w:r>
     </w:p>
     <w:p>
@@ -2662,11 +2219,7 @@
         </w:rPr>
       </w:pPr>
       <w:r>
-        <w:rPr>
-          <w:sz w:val="20"/>
-          <w:szCs w:val="20"/>
-        </w:rPr>
-        <w:t>MS Productos e Inventario ↔ 8085 Compras: recepción aceptada / CPP.</w:t>
+        <w:t>MS Productos e Inventario ↔ 8099 API Gateway: verificación y descuento/reserva de stock orquestado vía Gateway.</w:t>
       </w:r>
     </w:p>
     <w:p>
@@ -2681,13 +2234,7 @@
           <w:szCs w:val="20"/>
         </w:rPr>
       </w:pPr>
-      <w:r>
-        <w:rPr>
-          <w:sz w:val="20"/>
-          <w:szCs w:val="20"/>
-        </w:rPr>
-        <w:t>MS Productos e Inventario ↔ 8086 Finanzas: valorización/reportes.</w:t>
-      </w:r>
+      <w:r/>
     </w:p>
     <w:p>
       <w:pPr>
@@ -2773,11 +2320,7 @@
         </w:rPr>
       </w:pPr>
       <w:r>
-        <w:rPr>
-          <w:sz w:val="24"/>
-          <w:szCs w:val="24"/>
-        </w:rPr>
-        <w:t>3.4. MS Ventas y Reservas - Puerto 8084</w:t>
+        <w:t>3.4. MS Reservas y Entregas - Puerto 8084</w:t>
       </w:r>
     </w:p>
     <w:p>
@@ -2828,11 +2371,7 @@
         </w:rPr>
       </w:pPr>
       <w:r>
-        <w:rPr>
-          <w:sz w:val="20"/>
-          <w:szCs w:val="20"/>
-        </w:rPr>
-        <w:t>Código/etiqueta de bolsa de reserva.</w:t>
+        <w:t>Trazabilidad de preparación de reservas (HU31 CA2): registro de preparadaPorId y fechaPreparacion al armar el pedido.</w:t>
       </w:r>
     </w:p>
     <w:p>
@@ -2888,11 +2427,7 @@
         </w:rPr>
       </w:pPr>
       <w:r>
-        <w:rPr>
-          <w:sz w:val="20"/>
-          <w:szCs w:val="20"/>
-        </w:rPr>
-        <w:t xml:space="preserve">Venta (agrupa una o más líneas en DetalleVenta, originada por retiro de reserva o por venta presencial directa).</w:t>
+        <w:t>Entrega de materiales por concepto (agrupa líneas en DetalleEntrega): no existe facturación ni caja comercial abierta; consume saldo prepagado del alumno.</w:t>
       </w:r>
     </w:p>
     <w:p>
@@ -2938,7 +2473,7 @@
         </w:rPr>
       </w:pPr>
       <w:r>
-        <w:t>Responsabilidad funcional: Carrito de reserva multilínea, DetalleReserva, DetalleVenta, Ciclo de reserva (PENDIENTE → EN_PREPARACION → ETIQUETA_PENDIENTE → LISTA_PARA_RETIRO → ENTREGADA / CANCELADA), Venta presencial directa (alumnos ≥ 12 años), Devolución con motivo justificado. Base de datos propia: db_ventas_reservas. Historias relacionadas: HU27-HU37.</w:t>
+        <w:t>Responsabilidad funcional: Carrito de reserva multilínea, DetalleReserva, Entrega y DetalleEntrega, Devolucion y DetalleDevolucion, Ciclo de reserva (PENDIENTE, LISTA_PARA_RETIRO, ENTREGADA, CANCELADA), Notificación interna por correo a apoderados. Base de datos propia: db_reservas. Historias relacionadas: HU24-HU37, HU47-HU49.</w:t>
       </w:r>
     </w:p>
     <w:p>
@@ -3011,11 +2546,7 @@
         </w:rPr>
       </w:pPr>
       <w:r>
-        <w:rPr>
-          <w:sz w:val="20"/>
-          <w:szCs w:val="20"/>
-        </w:rPr>
-        <w:t>MS Ventas y Reservas ↔ 8086 Finanzas: ingreso por venta / reversa.</w:t>
+        <w:t>MS Reservas y Entregas ↔ 8099 API Gateway: validación de saldo y stock orquestada exclusivamente a través del Gateway.</w:t>
       </w:r>
     </w:p>
     <w:p>
@@ -3087,6 +2618,22 @@
     </w:p>
     <w:p>
       <w:pPr>
+        <w:pStyle w:val="Heading1"/>
+        <w:rPr>
+          <w:sz w:val="32"/>
+          <w:szCs w:val="32"/>
+        </w:rPr>
+      </w:pPr>
+      <w:r>
+        <w:rPr>
+          <w:sz w:val="32"/>
+          <w:szCs w:val="32"/>
+        </w:rPr>
+        <w:t>4. Flujos principales entre microservicios</w:t>
+      </w:r>
+    </w:p>
+    <w:p>
+      <w:pPr>
         <w:pStyle w:val="Heading2"/>
         <w:rPr>
           <w:sz w:val="24"/>
@@ -3094,11 +2641,30 @@
         </w:rPr>
       </w:pPr>
       <w:r>
+        <w:t>4.1 Entrega de materiales</w:t>
+      </w:r>
+    </w:p>
+    <w:p>
+      <w:pPr>
+        <w:rPr>
+          <w:sz w:val="20"/>
+          <w:szCs w:val="20"/>
+        </w:rPr>
+      </w:pPr>
+      <w:r>
+        <w:t>React → Gateway → Reservas y Entregas. Para el retiro de una reserva lista o una entrega presencial directa en mesón, el sistema descuenta el saldo del alumno en MS Saldos y descuenta el stock físico en MS Inventario a través del Gateway, generando la Entrega y notificando por correo a los apoderados vinculados al alumno.</w:t>
+      </w:r>
+    </w:p>
+    <w:p>
+      <w:pPr>
+        <w:pStyle w:val="Heading2"/>
         <w:rPr>
           <w:sz w:val="24"/>
           <w:szCs w:val="24"/>
         </w:rPr>
-        <w:t>3.5. MS Compras - Puerto 8085</w:t>
+      </w:pPr>
+      <w:r>
+        <w:t>4.2 Solicitud y aprobación de ajuste de stock</w:t>
       </w:r>
     </w:p>
     <w:p>
@@ -3109,1276 +2675,385 @@
         </w:rPr>
       </w:pPr>
       <w:r>
-        <w:rPr>
-          <w:sz w:val="20"/>
-          <w:szCs w:val="20"/>
-        </w:rPr>
-        <w:t>Gestionará el proceso desde el proveedor hasta la recepción de la factura y mercadería.</w:t>
+        <w:t>El Encargado detecta una diferencia en el stock físico y crea una SolicitudAjusteStock en MS Inventario indicando producto, cantidad y motivo. La solicitud queda en estado PENDIENTE. El Administrador revisa la solicitud en su panel y la aprueba o rechaza. Solo al aprobarse se ejecuta Producto.aplicarAjusteAprobado(), descontando o incrementando el stock físico y registrando el MovimientoInventario.</w:t>
       </w:r>
     </w:p>
     <w:p>
       <w:pPr>
-        <w:pStyle w:val="ListParagraph"/>
-        <w:numPr>
-          <w:ilvl w:val="0"/>
-          <w:numId w:val="12"/>
-        </w:numPr>
-        <w:rPr>
-          <w:sz w:val="20"/>
-          <w:szCs w:val="20"/>
-        </w:rPr>
-      </w:pPr>
-      <w:r>
-        <w:rPr>
-          <w:sz w:val="20"/>
-          <w:szCs w:val="20"/>
-        </w:rPr>
-        <w:t>Maestro de proveedores.</w:t>
+        <w:pStyle w:val="Heading1"/>
+        <w:rPr>
+          <w:sz w:val="32"/>
+          <w:szCs w:val="32"/>
+        </w:rPr>
+      </w:pPr>
+      <w:r>
+        <w:rPr>
+          <w:sz w:val="32"/>
+          <w:szCs w:val="32"/>
+        </w:rPr>
+        <w:lastRenderedPageBreak/>
+        <w:t>5</w:t>
+      </w:r>
+      <w:r>
+        <w:rPr>
+          <w:sz w:val="32"/>
+          <w:szCs w:val="32"/>
+        </w:rPr>
+        <w:t>. Organización interna sugerida de Spring Boot</w:t>
       </w:r>
     </w:p>
     <w:p>
       <w:pPr>
-        <w:pStyle w:val="ListParagraph"/>
-        <w:numPr>
-          <w:ilvl w:val="0"/>
-          <w:numId w:val="12"/>
-        </w:numPr>
-        <w:rPr>
-          <w:sz w:val="20"/>
-          <w:szCs w:val="20"/>
-        </w:rPr>
-      </w:pPr>
-      <w:r>
-        <w:rPr>
-          <w:sz w:val="20"/>
-          <w:szCs w:val="20"/>
-        </w:rPr>
-        <w:t>Datos bancarios del proveedor.</w:t>
+        <w:rPr>
+          <w:sz w:val="12"/>
+          <w:szCs w:val="20"/>
+        </w:rPr>
+      </w:pPr>
+      <w:r>
+        <w:rPr>
+          <w:sz w:val="20"/>
+          <w:szCs w:val="20"/>
+        </w:rPr>
+        <w:t>src/main/java/.../</w:t>
+      </w:r>
+      <w:r>
+        <w:rPr>
+          <w:sz w:val="20"/>
+          <w:szCs w:val="20"/>
+        </w:rPr>
+        <w:br/>
+      </w:r>
+      <w:r>
+        <w:rPr>
+          <w:rFonts w:ascii="MS Gothic" w:eastAsia="MS Gothic" w:hAnsi="MS Gothic" w:cs="MS Gothic" w:hint="eastAsia"/>
+          <w:sz w:val="20"/>
+          <w:szCs w:val="20"/>
+        </w:rPr>
+        <w:t>├</w:t>
+      </w:r>
+      <w:r>
+        <w:rPr>
+          <w:rFonts w:cs="Aptos"/>
+          <w:sz w:val="20"/>
+          <w:szCs w:val="20"/>
+        </w:rPr>
+        <w:t>──</w:t>
+      </w:r>
+      <w:r>
+        <w:rPr>
+          <w:sz w:val="20"/>
+          <w:szCs w:val="20"/>
+        </w:rPr>
+        <w:t xml:space="preserve"> controller/</w:t>
+      </w:r>
+      <w:r>
+        <w:rPr>
+          <w:sz w:val="20"/>
+          <w:szCs w:val="20"/>
+        </w:rPr>
+        <w:br/>
+      </w:r>
+      <w:r>
+        <w:rPr>
+          <w:rFonts w:ascii="MS Gothic" w:eastAsia="MS Gothic" w:hAnsi="MS Gothic" w:cs="MS Gothic" w:hint="eastAsia"/>
+          <w:sz w:val="20"/>
+          <w:szCs w:val="20"/>
+        </w:rPr>
+        <w:t>├</w:t>
+      </w:r>
+      <w:r>
+        <w:rPr>
+          <w:rFonts w:cs="Aptos"/>
+          <w:sz w:val="20"/>
+          <w:szCs w:val="20"/>
+        </w:rPr>
+        <w:t>──</w:t>
+      </w:r>
+      <w:r>
+        <w:rPr>
+          <w:sz w:val="20"/>
+          <w:szCs w:val="20"/>
+        </w:rPr>
+        <w:t xml:space="preserve"> service/</w:t>
+      </w:r>
+      <w:r>
+        <w:rPr>
+          <w:sz w:val="20"/>
+          <w:szCs w:val="20"/>
+        </w:rPr>
+        <w:br/>
+      </w:r>
+      <w:r>
+        <w:rPr>
+          <w:rFonts w:ascii="MS Gothic" w:eastAsia="MS Gothic" w:hAnsi="MS Gothic" w:cs="MS Gothic" w:hint="eastAsia"/>
+          <w:sz w:val="20"/>
+          <w:szCs w:val="20"/>
+        </w:rPr>
+        <w:t>├</w:t>
+      </w:r>
+      <w:r>
+        <w:rPr>
+          <w:rFonts w:cs="Aptos"/>
+          <w:sz w:val="20"/>
+          <w:szCs w:val="20"/>
+        </w:rPr>
+        <w:t>──</w:t>
+      </w:r>
+      <w:r>
+        <w:rPr>
+          <w:sz w:val="20"/>
+          <w:szCs w:val="20"/>
+        </w:rPr>
+        <w:t xml:space="preserve"> repository/</w:t>
+      </w:r>
+      <w:r>
+        <w:rPr>
+          <w:sz w:val="20"/>
+          <w:szCs w:val="20"/>
+        </w:rPr>
+        <w:br/>
+      </w:r>
+      <w:r>
+        <w:rPr>
+          <w:rFonts w:ascii="MS Gothic" w:eastAsia="MS Gothic" w:hAnsi="MS Gothic" w:cs="MS Gothic" w:hint="eastAsia"/>
+          <w:sz w:val="20"/>
+          <w:szCs w:val="20"/>
+        </w:rPr>
+        <w:t>├</w:t>
+      </w:r>
+      <w:r>
+        <w:rPr>
+          <w:rFonts w:cs="Aptos"/>
+          <w:sz w:val="20"/>
+          <w:szCs w:val="20"/>
+        </w:rPr>
+        <w:t>──</w:t>
+      </w:r>
+      <w:r>
+        <w:rPr>
+          <w:sz w:val="20"/>
+          <w:szCs w:val="20"/>
+        </w:rPr>
+        <w:t xml:space="preserve"> model/ (o entity/)</w:t>
+      </w:r>
+      <w:r>
+        <w:rPr>
+          <w:sz w:val="20"/>
+          <w:szCs w:val="20"/>
+        </w:rPr>
+        <w:br/>
+      </w:r>
+      <w:r>
+        <w:rPr>
+          <w:rFonts w:ascii="MS Gothic" w:eastAsia="MS Gothic" w:hAnsi="MS Gothic" w:cs="MS Gothic" w:hint="eastAsia"/>
+          <w:sz w:val="20"/>
+          <w:szCs w:val="20"/>
+        </w:rPr>
+        <w:t>├</w:t>
+      </w:r>
+      <w:r>
+        <w:rPr>
+          <w:rFonts w:cs="Aptos"/>
+          <w:sz w:val="20"/>
+          <w:szCs w:val="20"/>
+        </w:rPr>
+        <w:t>──</w:t>
+      </w:r>
+      <w:r>
+        <w:rPr>
+          <w:sz w:val="20"/>
+          <w:szCs w:val="20"/>
+        </w:rPr>
+        <w:t xml:space="preserve"> dto/</w:t>
+      </w:r>
+      <w:r>
+        <w:rPr>
+          <w:sz w:val="20"/>
+          <w:szCs w:val="20"/>
+        </w:rPr>
+        <w:br/>
+      </w:r>
+      <w:r>
+        <w:rPr>
+          <w:rFonts w:ascii="MS Gothic" w:eastAsia="MS Gothic" w:hAnsi="MS Gothic" w:cs="MS Gothic" w:hint="eastAsia"/>
+          <w:sz w:val="20"/>
+          <w:szCs w:val="20"/>
+        </w:rPr>
+        <w:t>├</w:t>
+      </w:r>
+      <w:r>
+        <w:rPr>
+          <w:rFonts w:cs="Aptos"/>
+          <w:sz w:val="20"/>
+          <w:szCs w:val="20"/>
+        </w:rPr>
+        <w:t>──</w:t>
+      </w:r>
+      <w:r>
+        <w:rPr>
+          <w:sz w:val="20"/>
+          <w:szCs w:val="20"/>
+        </w:rPr>
+        <w:t xml:space="preserve"> exception/</w:t>
+      </w:r>
+      <w:r>
+        <w:rPr>
+          <w:sz w:val="20"/>
+          <w:szCs w:val="20"/>
+        </w:rPr>
+        <w:br/>
+      </w:r>
+      <w:r>
+        <w:rPr>
+          <w:rFonts w:ascii="MS Gothic" w:eastAsia="MS Gothic" w:hAnsi="MS Gothic" w:cs="MS Gothic" w:hint="eastAsia"/>
+          <w:sz w:val="20"/>
+          <w:szCs w:val="20"/>
+        </w:rPr>
+        <w:t>├</w:t>
+      </w:r>
+      <w:r>
+        <w:rPr>
+          <w:rFonts w:cs="Aptos"/>
+          <w:sz w:val="20"/>
+          <w:szCs w:val="20"/>
+        </w:rPr>
+        <w:t>──</w:t>
+      </w:r>
+      <w:r>
+        <w:rPr>
+          <w:sz w:val="20"/>
+          <w:szCs w:val="20"/>
+        </w:rPr>
+        <w:t xml:space="preserve"> config/</w:t>
+      </w:r>
+      <w:r>
+        <w:rPr>
+          <w:sz w:val="20"/>
+          <w:szCs w:val="20"/>
+        </w:rPr>
+        <w:br/>
+        <w:t>└── client/       ← llamadas a otros microservicios cuando corresponda</w:t>
       </w:r>
     </w:p>
     <w:p>
       <w:pPr>
-        <w:pStyle w:val="ListParagraph"/>
-        <w:numPr>
-          <w:ilvl w:val="0"/>
-          <w:numId w:val="12"/>
-        </w:numPr>
-        <w:rPr>
-          <w:sz w:val="20"/>
-          <w:szCs w:val="20"/>
-        </w:rPr>
-      </w:pPr>
-      <w:r>
-        <w:rPr>
-          <w:sz w:val="20"/>
-          <w:szCs w:val="20"/>
-        </w:rPr>
-        <w:t>Orden de Compra (OC).</w:t>
+        <w:rPr>
+          <w:sz w:val="20"/>
+          <w:szCs w:val="20"/>
+        </w:rPr>
+      </w:pPr>
+      <w:r>
+        <w:rPr>
+          <w:sz w:val="20"/>
+          <w:szCs w:val="20"/>
+        </w:rPr>
+        <w:t xml:space="preserve">Dentro de un mismo microservicio se pueden separar paquetes por subdominio. Por ejemplo, Productos e Inventario puede organizar internamente producto, </w:t>
+      </w:r>
+      <w:r>
+        <w:rPr>
+          <w:sz w:val="20"/>
+          <w:szCs w:val="20"/>
+        </w:rPr>
+        <w:t>categoría</w:t>
+      </w:r>
+      <w:r>
+        <w:rPr>
+          <w:sz w:val="20"/>
+          <w:szCs w:val="20"/>
+        </w:rPr>
+        <w:t xml:space="preserve">, stock, movimiento, ajuste e </w:t>
+      </w:r>
+      <w:r>
+        <w:rPr>
+          <w:sz w:val="20"/>
+          <w:szCs w:val="20"/>
+        </w:rPr>
+        <w:t>inventario físico</w:t>
+      </w:r>
+      <w:r>
+        <w:rPr>
+          <w:sz w:val="20"/>
+          <w:szCs w:val="20"/>
+        </w:rPr>
+        <w:t xml:space="preserve"> sin necesidad de crear un microservicio adicional.</w:t>
       </w:r>
     </w:p>
     <w:p>
       <w:pPr>
-        <w:pStyle w:val="ListParagraph"/>
-        <w:numPr>
-          <w:ilvl w:val="0"/>
-          <w:numId w:val="12"/>
-        </w:numPr>
-        <w:rPr>
-          <w:sz w:val="20"/>
-          <w:szCs w:val="20"/>
-        </w:rPr>
-      </w:pPr>
-      <w:r>
-        <w:rPr>
-          <w:sz w:val="20"/>
-          <w:szCs w:val="20"/>
-        </w:rPr>
-        <w:t>Detalle de OC.</w:t>
+        <w:pStyle w:val="Heading1"/>
+        <w:rPr>
+          <w:sz w:val="32"/>
+          <w:szCs w:val="32"/>
+        </w:rPr>
+      </w:pPr>
+      <w:r>
+        <w:rPr>
+          <w:sz w:val="32"/>
+          <w:szCs w:val="32"/>
+        </w:rPr>
+        <w:t xml:space="preserve">6. </w:t>
+      </w:r>
+      <w:r>
+        <w:rPr>
+          <w:sz w:val="32"/>
+          <w:szCs w:val="32"/>
+        </w:rPr>
+        <w:t>Próximos pasos</w:t>
       </w:r>
     </w:p>
     <w:p>
       <w:pPr>
-        <w:pStyle w:val="ListParagraph"/>
-        <w:numPr>
-          <w:ilvl w:val="0"/>
-          <w:numId w:val="12"/>
-        </w:numPr>
-        <w:rPr>
-          <w:sz w:val="20"/>
-          <w:szCs w:val="20"/>
-        </w:rPr>
-      </w:pPr>
-      <w:r>
-        <w:rPr>
-          <w:sz w:val="20"/>
-          <w:szCs w:val="20"/>
-        </w:rPr>
-        <w:t xml:space="preserve">Recepción de mercadería por el Encargado.</w:t>
+        <w:rPr>
+          <w:sz w:val="20"/>
+          <w:szCs w:val="20"/>
+        </w:rPr>
+      </w:pPr>
+      <w:r>
+        <w:t>1. Definir entidades y tablas de cada uno de los cuatro microservicios.</w:t>
       </w:r>
     </w:p>
     <w:p>
       <w:pPr>
-        <w:pStyle w:val="ListParagraph"/>
-        <w:numPr>
-          <w:ilvl w:val="0"/>
-          <w:numId w:val="12"/>
-        </w:numPr>
-        <w:rPr>
-          <w:sz w:val="20"/>
-          <w:szCs w:val="20"/>
-        </w:rPr>
-      </w:pPr>
-      <w:r>
-        <w:rPr>
-          <w:sz w:val="20"/>
-          <w:szCs w:val="20"/>
-        </w:rPr>
-        <w:t xml:space="preserve">Una o más facturas por recepción, cada una con sus líneas de detalle (1 a 60 ítems, límite del SII).</w:t>
+        <w:rPr>
+          <w:sz w:val="20"/>
+          <w:szCs w:val="20"/>
+        </w:rPr>
+      </w:pPr>
+      <w:r>
+        <w:rPr>
+          <w:sz w:val="20"/>
+          <w:szCs w:val="20"/>
+        </w:rPr>
+        <w:t>2. Definir relaciones internas y referencias entre servicios.</w:t>
       </w:r>
     </w:p>
     <w:p>
       <w:pPr>
-        <w:pStyle w:val="ListParagraph"/>
-        <w:numPr>
-          <w:ilvl w:val="0"/>
-          <w:numId w:val="12"/>
-        </w:numPr>
-        <w:rPr>
-          <w:sz w:val="20"/>
-          <w:szCs w:val="20"/>
-        </w:rPr>
-      </w:pPr>
-      <w:r>
-        <w:rPr>
-          <w:sz w:val="20"/>
-          <w:szCs w:val="20"/>
-        </w:rPr>
-        <w:t xml:space="preserve">Contacto del proveedor con nombre atomizado (primer nombre, segundo nombre, primer apellido, segundo apellido), correo y teléfono.</w:t>
-      </w:r>
-    </w:p>
-    <w:p>
-      <w:pPr>
-        <w:rPr>
-          <w:sz w:val="20"/>
-          <w:szCs w:val="20"/>
-        </w:rPr>
-      </w:pPr>
-      <w:r>
-        <w:rPr>
-          <w:sz w:val="20"/>
-          <w:szCs w:val="20"/>
-        </w:rPr>
-        <w:lastRenderedPageBreak/>
-        <w:t>La OC se confeccionará utilizando valores netos. Por cada ítem se ingresará cantidad y valor neto unitario; el sistema calculará Neto + IVA 19% + Total.</w:t>
-      </w:r>
-    </w:p>
-    <w:p>
-      <w:pPr>
-        <w:rPr>
-          <w:sz w:val="20"/>
-          <w:szCs w:val="20"/>
-        </w:rPr>
-      </w:pPr>
-      <w:r>
-        <w:t>La recepción la realiza el Encargado comparando OC, facturas y mercadería física. Solo existen recepciones COMPLETAS o INCOMPLETAS. Para auditar artículos no ordenados (HU49 CA3), DetalleFactura captura productoId opcional [0..1], sku y descripcionOriginal. Si las facturas no coinciden con la mercadería recibida o contienen artículos no ordenados, la recepción puntual se RECHAZA en un solo POST atómico junto con todas sus facturas, sin actualizar el stock ni alterar el CPP; la OC permanece vigente (EMITIDA o RECEPCIÓN_PARCIAL) a la espera de un nuevo despacho corregido. La regla de factura única (proveedorId + numero) se valida a nivel de aplicación en backend, permitiendo reusar el número si el intento previo fue RECHAZADA.</w:t>
-      </w:r>
-    </w:p>
-    <w:p>
-      <w:pPr>
-        <w:rPr>
-          <w:sz w:val="20"/>
-          <w:szCs w:val="20"/>
-        </w:rPr>
-      </w:pPr>
-      <w:r>
-        <w:t>Una recepción incompleta es válida cuando la suma de sus facturas coincide exactamente con la parte de la OC que efectivamente llegó. Cada recepción vincula una o más facturas (ej. por el límite de 60 ítems del SII). Se elimina el ciclo ORM directo Factura → OrdenCompra: se vinculan jerárquicamente a través de Recepción. Todos los montos financieros operan bajo tipos Long para prevenir desbordamientos en moneda chilena. El costo unitario enviado a Inventario para el CPP promedia el valor real facturado con IVA (redondeado a Long), descartando el precio estimado de la OC. La factura adquiere el estado PAGADA cuando Finanzas notifica la liquidación del egreso.</w:t>
-      </w:r>
-    </w:p>
-    <w:p>
-      <w:pPr>
-        <w:rPr>
-          <w:sz w:val="20"/>
-          <w:szCs w:val="20"/>
-        </w:rPr>
-      </w:pPr>
-      <w:r>
-        <w:t>Responsabilidad funcional: Proveedores, OC en neto, Recepción atómica parcial/total, Rechazo con auditoría de intrusos, Factura por recepción con límite de 60 líneas, Costo real con IVA promediado (Long), Ciclo de factura (ACEPTADA, RECHAZADA, PAGADA). Base de datos propia: db_compras. Historias relacionadas: HU46-HU49.</w:t>
-      </w:r>
-    </w:p>
-    <w:p>
-      <w:pPr>
-        <w:pStyle w:val="Heading3"/>
-        <w:rPr>
-          <w:sz w:val="22"/>
-          <w:szCs w:val="22"/>
-        </w:rPr>
-      </w:pPr>
-      <w:r>
-        <w:rPr>
-          <w:sz w:val="22"/>
-          <w:szCs w:val="22"/>
-        </w:rPr>
-        <w:t>Integraciones REST</w:t>
-      </w:r>
-    </w:p>
-    <w:p>
-      <w:pPr>
-        <w:rPr>
-          <w:sz w:val="20"/>
-          <w:szCs w:val="20"/>
-        </w:rPr>
-      </w:pPr>
-      <w:r>
-        <w:rPr>
-          <w:sz w:val="20"/>
-          <w:szCs w:val="20"/>
-        </w:rPr>
-        <w:t>MS Compras ↔ 8083 Productos e Inventario: entrada stock + actualización CPP.</w:t>
-      </w:r>
-    </w:p>
-    <w:p>
-      <w:pPr>
-        <w:rPr>
-          <w:sz w:val="20"/>
-          <w:szCs w:val="20"/>
-        </w:rPr>
-      </w:pPr>
-      <w:r>
-        <w:t>MS Compras ↔ 8086 Finanzas: solicitud/pago factura y notificación de factura PAGADA tras doble firma.</w:t>
-      </w:r>
-    </w:p>
-    <w:p>
-      <w:pPr>
-        <w:rPr>
-          <w:sz w:val="16"/>
-          <w:szCs w:val="16"/>
-        </w:rPr>
-      </w:pPr>
-      <w:r>
-        <w:rPr>
-          <w:noProof/>
-          <w:sz w:val="16"/>
-          <w:szCs w:val="16"/>
-        </w:rPr>
-        <w:drawing>
-          <wp:inline distT="0" distB="0" distL="0" distR="0" wp14:anchorId="3A3B1D96" wp14:editId="320CC986">
-            <wp:extent cx="4484535" cy="5519884"/>
-            <wp:effectExtent l="0" t="0" r="0" b="5080"/>
-            <wp:docPr id="6" name="Picture 6"/>
-            <wp:cNvGraphicFramePr>
-              <a:graphicFrameLocks xmlns:a="http://schemas.openxmlformats.org/drawingml/2006/main" noChangeAspect="1"/>
-            </wp:cNvGraphicFramePr>
-            <a:graphic xmlns:a="http://schemas.openxmlformats.org/drawingml/2006/main">
-              <a:graphicData uri="http://schemas.openxmlformats.org/drawingml/2006/picture">
-                <pic:pic xmlns:pic="http://schemas.openxmlformats.org/drawingml/2006/picture">
-                  <pic:nvPicPr>
-                    <pic:cNvPr id="0" name="05_MS_Compras.png"/>
-                    <pic:cNvPicPr/>
-                  </pic:nvPicPr>
-                  <pic:blipFill rotWithShape="1">
-                    <a:blip r:embed="rId11"/>
-                    <a:srcRect l="2733" t="2950" r="3099" b="2155"/>
-                    <a:stretch>
-                      <a:fillRect/>
-                    </a:stretch>
-                  </pic:blipFill>
-                  <pic:spPr bwMode="auto">
-                    <a:xfrm>
-                      <a:off x="0" y="0"/>
-                      <a:ext cx="4534908" cy="5581886"/>
-                    </a:xfrm>
-                    <a:prstGeom prst="rect">
-                      <a:avLst/>
-                    </a:prstGeom>
-                    <a:ln>
-                      <a:noFill/>
-                    </a:ln>
-                    <a:extLst>
-                      <a:ext uri="{53640926-AAD7-44D8-BBD7-CCE9431645EC}">
-                        <a14:shadowObscured xmlns:a14="http://schemas.microsoft.com/office/drawing/2010/main"/>
-                      </a:ext>
-                    </a:extLst>
-                  </pic:spPr>
-                </pic:pic>
-              </a:graphicData>
-            </a:graphic>
-          </wp:inline>
-        </w:drawing>
-      </w:r>
-    </w:p>
-    <w:p>
-      <w:pPr>
-        <w:jc w:val="center"/>
-        <w:rPr>
-          <w:sz w:val="16"/>
-          <w:szCs w:val="16"/>
-        </w:rPr>
-      </w:pPr>
-      <w:r>
-        <w:rPr>
-          <w:sz w:val="16"/>
-          <w:szCs w:val="16"/>
-        </w:rPr>
-        <w:t>Figura 6. Diagrama técnico de MS Compras.</w:t>
-      </w:r>
-    </w:p>
-    <w:p>
-      <w:pPr>
-        <w:pStyle w:val="Heading2"/>
-        <w:rPr>
-          <w:sz w:val="24"/>
-          <w:szCs w:val="24"/>
-        </w:rPr>
-      </w:pPr>
-      <w:r>
-        <w:rPr>
-          <w:sz w:val="24"/>
-          <w:szCs w:val="24"/>
-        </w:rPr>
-        <w:lastRenderedPageBreak/>
-        <w:t>3.6. MS Finanzas y Configuración - Puerto 8086</w:t>
-      </w:r>
-    </w:p>
-    <w:p>
-      <w:pPr>
-        <w:rPr>
-          <w:sz w:val="20"/>
-          <w:szCs w:val="20"/>
-        </w:rPr>
-      </w:pPr>
-      <w:r>
-        <w:rPr>
-          <w:sz w:val="20"/>
-          <w:szCs w:val="20"/>
-        </w:rPr>
-        <w:t>Gestionará la Cuenta Librería y las operaciones financieras/administrativas.</w:t>
-      </w:r>
-    </w:p>
-    <w:p>
-      <w:pPr>
-        <w:pStyle w:val="ListParagraph"/>
-        <w:numPr>
-          <w:ilvl w:val="0"/>
-          <w:numId w:val="12"/>
-        </w:numPr>
-        <w:rPr>
-          <w:sz w:val="20"/>
-          <w:szCs w:val="20"/>
-        </w:rPr>
-      </w:pPr>
-      <w:r>
-        <w:rPr>
-          <w:sz w:val="20"/>
-          <w:szCs w:val="20"/>
-        </w:rPr>
-        <w:t>Cartola de ingresos y egresos.</w:t>
-      </w:r>
-    </w:p>
-    <w:p>
-      <w:pPr>
-        <w:pStyle w:val="ListParagraph"/>
-        <w:numPr>
-          <w:ilvl w:val="0"/>
-          <w:numId w:val="12"/>
-        </w:numPr>
-        <w:rPr>
-          <w:sz w:val="20"/>
-          <w:szCs w:val="20"/>
-        </w:rPr>
-      </w:pPr>
-      <w:r>
-        <w:rPr>
-          <w:sz w:val="20"/>
-          <w:szCs w:val="20"/>
-        </w:rPr>
-        <w:t xml:space="preserve">Cartola de caja: saldo de apertura, abonos, pagos de facturas, devoluciones de saldo a apoderados y saldo actual. Las ventas y devoluciones no mueven caja (consumen saldo ya abonado): se registran como resultados, para evitar la doble contabilización (HU54, HU58).</w:t>
-      </w:r>
-    </w:p>
-    <w:p>
-      <w:pPr>
-        <w:pStyle w:val="ListParagraph"/>
-        <w:numPr>
-          <w:ilvl w:val="0"/>
-          <w:numId w:val="12"/>
-        </w:numPr>
-        <w:rPr>
-          <w:sz w:val="20"/>
-          <w:szCs w:val="20"/>
-        </w:rPr>
-      </w:pPr>
-      <w:r>
-        <w:rPr>
-          <w:sz w:val="20"/>
-          <w:szCs w:val="20"/>
-        </w:rPr>
-        <w:t>Resultados y utilidad.</w:t>
-      </w:r>
-    </w:p>
-    <w:p>
-      <w:pPr>
-        <w:pStyle w:val="ListParagraph"/>
-        <w:numPr>
-          <w:ilvl w:val="0"/>
-          <w:numId w:val="12"/>
-        </w:numPr>
-        <w:rPr>
-          <w:sz w:val="20"/>
-          <w:szCs w:val="20"/>
-        </w:rPr>
-      </w:pPr>
-      <w:r>
-        <w:rPr>
-          <w:sz w:val="20"/>
-          <w:szCs w:val="20"/>
-        </w:rPr>
-        <w:t>Facturas pendientes de pago.</w:t>
-      </w:r>
-    </w:p>
-    <w:p>
-      <w:pPr>
-        <w:pStyle w:val="ListParagraph"/>
-        <w:numPr>
-          <w:ilvl w:val="0"/>
-          <w:numId w:val="12"/>
-        </w:numPr>
-        <w:rPr>
-          <w:sz w:val="20"/>
-          <w:szCs w:val="20"/>
-        </w:rPr>
-      </w:pPr>
-      <w:r>
-        <w:rPr>
-          <w:sz w:val="20"/>
-          <w:szCs w:val="20"/>
-        </w:rPr>
-        <w:t>Solicitud de pago.</w:t>
-      </w:r>
-    </w:p>
-    <w:p>
-      <w:pPr>
-        <w:pStyle w:val="ListParagraph"/>
-        <w:numPr>
-          <w:ilvl w:val="0"/>
-          <w:numId w:val="12"/>
-        </w:numPr>
-        <w:rPr>
-          <w:sz w:val="20"/>
-          <w:szCs w:val="20"/>
-        </w:rPr>
-      </w:pPr>
-      <w:r>
-        <w:rPr>
-          <w:sz w:val="20"/>
-          <w:szCs w:val="20"/>
-        </w:rPr>
-        <w:t>Segunda autorización.</w:t>
-      </w:r>
-    </w:p>
-    <w:p>
-      <w:pPr>
-        <w:pStyle w:val="ListParagraph"/>
-        <w:numPr>
-          <w:ilvl w:val="0"/>
-          <w:numId w:val="12"/>
-        </w:numPr>
-        <w:rPr>
-          <w:sz w:val="20"/>
-          <w:szCs w:val="20"/>
-        </w:rPr>
-      </w:pPr>
-      <w:r>
-        <w:rPr>
-          <w:sz w:val="20"/>
-          <w:szCs w:val="20"/>
-        </w:rPr>
-        <w:t>Registro del pago y egreso automático en Cuenta Librería.</w:t>
-      </w:r>
-    </w:p>
-    <w:p>
-      <w:pPr>
-        <w:pStyle w:val="ListParagraph"/>
-        <w:numPr>
-          <w:ilvl w:val="0"/>
-          <w:numId w:val="12"/>
-        </w:numPr>
-        <w:rPr>
-          <w:sz w:val="20"/>
-          <w:szCs w:val="20"/>
-        </w:rPr>
-      </w:pPr>
-      <w:r>
-        <w:rPr>
-          <w:sz w:val="20"/>
-          <w:szCs w:val="20"/>
-        </w:rPr>
-        <w:t>Historial de autorizaciones.</w:t>
-      </w:r>
-    </w:p>
-    <w:p>
-      <w:pPr>
-        <w:pStyle w:val="ListParagraph"/>
-        <w:numPr>
-          <w:ilvl w:val="0"/>
-          <w:numId w:val="12"/>
-        </w:numPr>
-        <w:rPr>
-          <w:sz w:val="20"/>
-          <w:szCs w:val="20"/>
-        </w:rPr>
-      </w:pPr>
-      <w:r>
-        <w:rPr>
-          <w:sz w:val="20"/>
-          <w:szCs w:val="20"/>
-        </w:rPr>
-        <w:t>Configuración institucional: nombre del colegio, librería, datos y logo.</w:t>
-      </w:r>
-    </w:p>
-    <w:p>
-      <w:pPr>
-        <w:rPr>
-          <w:sz w:val="20"/>
-          <w:szCs w:val="20"/>
-        </w:rPr>
-      </w:pPr>
-      <w:r>
-        <w:t>No se admitirán pagos parciales de facturas. Una factura aceptada se paga completa. ItemFacturaPorPagar actúa como proyección de lectura en db_finanzas_config para que el Autorizador audite los productos recibidos que respaldan el pago de forma autónoma. Al completarse el pago con doble firma, Finanzas registra el egreso automático en Cuenta Librería y notifica a MS Compras para cambiar el estado de la factura a PAGADA.</w:t>
-      </w:r>
-    </w:p>
-    <w:p>
-      <w:pPr>
-        <w:rPr>
-          <w:sz w:val="20"/>
-          <w:szCs w:val="20"/>
-        </w:rPr>
-      </w:pPr>
-      <w:r>
-        <w:rPr>
-          <w:sz w:val="20"/>
-          <w:szCs w:val="20"/>
-        </w:rPr>
-        <w:t>El Autorizador tendrá acceso de consulta a la Cuenta Librería y a las gestiones que requieren segunda firma, pero no podrá operar Inventario, Compras, Productos ni Configuración.</w:t>
-      </w:r>
-    </w:p>
-    <w:p>
-      <w:pPr>
-        <w:rPr>
-          <w:sz w:val="20"/>
-          <w:szCs w:val="20"/>
-        </w:rPr>
-      </w:pPr>
-      <w:r>
-        <w:rPr>
-          <w:sz w:val="20"/>
-          <w:szCs w:val="20"/>
-        </w:rPr>
-        <w:t xml:space="preserve">Responsabilidad funcional: Cuenta Librería/cartola, Doble autorización pagos, Reportes/Excel, Cierre ABIERTO→EN_REVISIÓN→CERRADO (manual o automático al vencer el plazo de revisión), Parámetros, Datos institución, Auditoría. Base de datos propia: db_finanzas_config. Historias relacionadas: HU54-HU69 (según responsabilidad).</w:t>
-      </w:r>
-    </w:p>
-    <w:p>
-      <w:pPr>
-        <w:pStyle w:val="Heading3"/>
-        <w:rPr>
-          <w:sz w:val="22"/>
-          <w:szCs w:val="22"/>
-        </w:rPr>
-      </w:pPr>
-      <w:r>
-        <w:rPr>
-          <w:sz w:val="22"/>
-          <w:szCs w:val="22"/>
-        </w:rPr>
-        <w:t>Integraciones REST</w:t>
-      </w:r>
-    </w:p>
-    <w:p>
-      <w:pPr>
-        <w:pStyle w:val="ListParagraph"/>
-        <w:numPr>
-          <w:ilvl w:val="0"/>
-          <w:numId w:val="12"/>
-        </w:numPr>
-        <w:rPr>
-          <w:sz w:val="20"/>
-          <w:szCs w:val="20"/>
-        </w:rPr>
-      </w:pPr>
-      <w:r>
-        <w:rPr>
-          <w:sz w:val="20"/>
-          <w:szCs w:val="20"/>
-        </w:rPr>
-        <w:t>MS Finanzas y Configuración ↔ 8081 Auth y Usuarios: rol/identidad.</w:t>
-      </w:r>
-    </w:p>
-    <w:p>
-      <w:pPr>
-        <w:pStyle w:val="ListParagraph"/>
-        <w:numPr>
-          <w:ilvl w:val="0"/>
-          <w:numId w:val="12"/>
-        </w:numPr>
-        <w:rPr>
-          <w:sz w:val="20"/>
-          <w:szCs w:val="20"/>
-        </w:rPr>
-      </w:pPr>
-      <w:r>
-        <w:rPr>
-          <w:sz w:val="20"/>
-          <w:szCs w:val="20"/>
-        </w:rPr>
-        <w:t>MS Finanzas y Configuración ↔ 8082 Alumnos y Saldos: abonos.</w:t>
-      </w:r>
-    </w:p>
-    <w:p>
-      <w:pPr>
-        <w:pStyle w:val="ListParagraph"/>
-        <w:numPr>
-          <w:ilvl w:val="0"/>
-          <w:numId w:val="12"/>
-        </w:numPr>
-        <w:rPr>
-          <w:sz w:val="20"/>
-          <w:szCs w:val="20"/>
-        </w:rPr>
-      </w:pPr>
-      <w:r>
-        <w:rPr>
-          <w:sz w:val="20"/>
-          <w:szCs w:val="20"/>
-        </w:rPr>
-        <w:t>MS Finanzas y Configuración ↔ 8083 Inventario: valorización.</w:t>
-      </w:r>
-    </w:p>
-    <w:p>
-      <w:pPr>
-        <w:pStyle w:val="ListParagraph"/>
-        <w:numPr>
-          <w:ilvl w:val="0"/>
-          <w:numId w:val="12"/>
-        </w:numPr>
-        <w:rPr>
-          <w:sz w:val="20"/>
-          <w:szCs w:val="20"/>
-        </w:rPr>
-      </w:pPr>
-      <w:r>
-        <w:rPr>
-          <w:sz w:val="20"/>
-          <w:szCs w:val="20"/>
-        </w:rPr>
-        <w:t>MS Finanzas y Configuración ↔ 8084 Ventas: ingresos/devoluciones.</w:t>
-      </w:r>
-    </w:p>
-    <w:p>
-      <w:pPr>
-        <w:pStyle w:val="ListParagraph"/>
-        <w:numPr>
-          <w:ilvl w:val="0"/>
-          <w:numId w:val="12"/>
-        </w:numPr>
-        <w:rPr>
-          <w:sz w:val="20"/>
-          <w:szCs w:val="20"/>
-        </w:rPr>
-      </w:pPr>
-      <w:r>
-        <w:rPr>
-          <w:sz w:val="20"/>
-          <w:szCs w:val="20"/>
-        </w:rPr>
-        <w:t>MS Finanzas y Configuración ↔ 8085 Compras: facturas/pagos.</w:t>
-      </w:r>
-    </w:p>
-    <w:p>
-      <w:pPr>
-        <w:pStyle w:val="ListBullet"/>
-        <w:numPr>
-          <w:ilvl w:val="0"/>
-          <w:numId w:val="0"/>
-        </w:numPr>
-        <w:ind w:left="360"/>
-        <w:rPr>
-          <w:sz w:val="16"/>
-          <w:szCs w:val="16"/>
-        </w:rPr>
-      </w:pPr>
-      <w:r>
-        <w:rPr>
-          <w:noProof/>
-          <w:sz w:val="16"/>
-          <w:szCs w:val="16"/>
-        </w:rPr>
-        <w:lastRenderedPageBreak/>
-        <w:drawing>
-          <wp:inline distT="0" distB="0" distL="0" distR="0" wp14:anchorId="33626CC3" wp14:editId="20AA7A5A">
-            <wp:extent cx="5542059" cy="4510482"/>
-            <wp:effectExtent l="0" t="0" r="1905" b="4445"/>
-            <wp:docPr id="7" name="Picture 7"/>
-            <wp:cNvGraphicFramePr>
-              <a:graphicFrameLocks xmlns:a="http://schemas.openxmlformats.org/drawingml/2006/main" noChangeAspect="1"/>
-            </wp:cNvGraphicFramePr>
-            <a:graphic xmlns:a="http://schemas.openxmlformats.org/drawingml/2006/main">
-              <a:graphicData uri="http://schemas.openxmlformats.org/drawingml/2006/picture">
-                <pic:pic xmlns:pic="http://schemas.openxmlformats.org/drawingml/2006/picture">
-                  <pic:nvPicPr>
-                    <pic:cNvPr id="0" name="06_MS_Finanzas_y_Configuración.png"/>
-                    <pic:cNvPicPr/>
-                  </pic:nvPicPr>
-                  <pic:blipFill rotWithShape="1">
-                    <a:blip r:embed="rId12"/>
-                    <a:srcRect l="1616" t="2414" r="1606" b="1907"/>
-                    <a:stretch>
-                      <a:fillRect/>
-                    </a:stretch>
-                  </pic:blipFill>
-                  <pic:spPr bwMode="auto">
-                    <a:xfrm>
-                      <a:off x="0" y="0"/>
-                      <a:ext cx="5590094" cy="4549576"/>
-                    </a:xfrm>
-                    <a:prstGeom prst="rect">
-                      <a:avLst/>
-                    </a:prstGeom>
-                    <a:ln>
-                      <a:noFill/>
-                    </a:ln>
-                    <a:extLst>
-                      <a:ext uri="{53640926-AAD7-44D8-BBD7-CCE9431645EC}">
-                        <a14:shadowObscured xmlns:a14="http://schemas.microsoft.com/office/drawing/2010/main"/>
-                      </a:ext>
-                    </a:extLst>
-                  </pic:spPr>
-                </pic:pic>
-              </a:graphicData>
-            </a:graphic>
-          </wp:inline>
-        </w:drawing>
-      </w:r>
-    </w:p>
-    <w:p>
-      <w:pPr>
-        <w:jc w:val="center"/>
-        <w:rPr>
-          <w:sz w:val="16"/>
-          <w:szCs w:val="16"/>
-        </w:rPr>
-      </w:pPr>
-      <w:r>
-        <w:rPr>
-          <w:sz w:val="16"/>
-          <w:szCs w:val="16"/>
-        </w:rPr>
-        <w:t>Figura 7. Diagrama técnico de MS Finanzas y Configuración.</w:t>
-      </w:r>
-    </w:p>
-    <w:p>
-      <w:pPr>
-        <w:pStyle w:val="Heading1"/>
-        <w:rPr>
-          <w:sz w:val="32"/>
-          <w:szCs w:val="32"/>
-        </w:rPr>
-      </w:pPr>
-      <w:r>
-        <w:rPr>
-          <w:sz w:val="32"/>
-          <w:szCs w:val="32"/>
-        </w:rPr>
-        <w:t>4. Flujos principales entre microservicios</w:t>
-      </w:r>
-    </w:p>
-    <w:p>
-      <w:pPr>
-        <w:pStyle w:val="Heading2"/>
-        <w:rPr>
-          <w:sz w:val="24"/>
-          <w:szCs w:val="24"/>
-        </w:rPr>
-      </w:pPr>
-      <w:r>
-        <w:rPr>
-          <w:sz w:val="24"/>
-          <w:szCs w:val="24"/>
-        </w:rPr>
-        <w:t>4.1 Venta o entrega</w:t>
-      </w:r>
-    </w:p>
-    <w:p>
-      <w:pPr>
-        <w:rPr>
-          <w:sz w:val="20"/>
-          <w:szCs w:val="20"/>
-        </w:rPr>
-      </w:pPr>
-      <w:r>
-        <w:rPr>
-          <w:sz w:val="20"/>
-          <w:szCs w:val="20"/>
-        </w:rPr>
-        <w:t>React → Gateway → Ventas/Reservas. Ventas valida al alumno y solicita a Alumnos/Saldos el movimiento correspondiente; solicita a Productos/Inventario la validación y descuento de stock; y comunica el movimiento financiero a Finanzas/Configuración.</w:t>
-      </w:r>
-    </w:p>
-    <w:p>
-      <w:pPr>
-        <w:pStyle w:val="Heading2"/>
-        <w:rPr>
-          <w:sz w:val="24"/>
-          <w:szCs w:val="24"/>
-        </w:rPr>
-      </w:pPr>
-      <w:r>
-        <w:rPr>
-          <w:sz w:val="24"/>
-          <w:szCs w:val="24"/>
-        </w:rPr>
-        <w:t>4.2 Orden de compra y recepción</w:t>
-      </w:r>
-    </w:p>
-    <w:p>
-      <w:pPr>
-        <w:rPr>
-          <w:sz w:val="20"/>
-          <w:szCs w:val="20"/>
-        </w:rPr>
-      </w:pPr>
-      <w:r>
-        <w:t>React → Gateway → Compras. El Administrador emite la OC en valores netos con sus líneas de DetalleOrdenCompra. Posteriormente el Encargado recepciona la mercadería con una o más facturas en un solo POST atómico. Si las facturas no coinciden o traen artículos no ordenados, se auditan en DetalleFactura (con productoId opcional y descripción) y se rechaza la recepción puntual con todas sus facturas, manteniendo la OC vigente. Si la recepción es válida, Compras envía a Productos/Inventario el aumento de stock físico y el recálculo del CPP utilizando el promedio real facturado con IVA incluido en Long.</w:t>
-      </w:r>
-    </w:p>
-    <w:p>
-      <w:pPr>
-        <w:pStyle w:val="Heading2"/>
-        <w:rPr>
-          <w:sz w:val="24"/>
-          <w:szCs w:val="24"/>
-        </w:rPr>
-      </w:pPr>
-      <w:r>
-        <w:rPr>
-          <w:sz w:val="24"/>
-          <w:szCs w:val="24"/>
-        </w:rPr>
-        <w:t>4.3 Pago de factura</w:t>
-      </w:r>
-    </w:p>
-    <w:p>
-      <w:pPr>
-        <w:rPr>
-          <w:sz w:val="20"/>
-          <w:szCs w:val="20"/>
-        </w:rPr>
-      </w:pPr>
-      <w:r>
-        <w:t>La factura aceptada pasa desde Compras a Finanzas/Configuración como FacturaPorPagar (con su proyección de ítems recibidos). El Administrador solicita el pago y el Autorizador revisa el detalle y aprueba o rechaza (segunda firma). Si se aprueba, se registra el pago, se genera automáticamente el egreso en la Cuenta Librería, y Finanzas notifica a Compras para que la factura pase al estado PAGADA.</w:t>
-      </w:r>
-    </w:p>
-    <w:p>
-      <w:pPr>
-        <w:pStyle w:val="Heading2"/>
-        <w:rPr>
-          <w:sz w:val="24"/>
-          <w:szCs w:val="24"/>
-        </w:rPr>
-      </w:pPr>
-      <w:r>
-        <w:rPr>
-          <w:sz w:val="24"/>
-          <w:szCs w:val="24"/>
-        </w:rPr>
-        <w:t>4.4 Ajuste de stock</w:t>
-      </w:r>
-    </w:p>
-    <w:p>
-      <w:pPr>
-        <w:rPr>
-          <w:sz w:val="20"/>
-          <w:szCs w:val="20"/>
-        </w:rPr>
-      </w:pPr>
-      <w:r>
-        <w:rPr>
-          <w:sz w:val="20"/>
-          <w:szCs w:val="20"/>
-        </w:rPr>
-        <w:t xml:space="preserve">El Encargado reporta en Productos/Inventario una diferencia de stock (desde la operación diaria o un inventario físico). El Administrador revisa el reporte y lo descarta con motivo o crea la solicitud de ajuste indicando producto, cantidad y motivo. La solicitud queda pendiente. El Autorizador revisa y aprueba o rechaza. Solo después de la aprobación se modifica el stock y queda el registro de auditoría.</w:t>
-      </w:r>
-    </w:p>
-    <w:p>
-      <w:pPr>
-        <w:pStyle w:val="Heading1"/>
-        <w:rPr>
-          <w:sz w:val="32"/>
-          <w:szCs w:val="32"/>
-        </w:rPr>
-      </w:pPr>
-      <w:r>
-        <w:rPr>
-          <w:sz w:val="32"/>
-          <w:szCs w:val="32"/>
-        </w:rPr>
-        <w:lastRenderedPageBreak/>
-        <w:t>5</w:t>
-      </w:r>
-      <w:r>
-        <w:rPr>
-          <w:sz w:val="32"/>
-          <w:szCs w:val="32"/>
-        </w:rPr>
-        <w:t>. Organización interna sugerida de Spring Boot</w:t>
-      </w:r>
-    </w:p>
-    <w:p>
-      <w:pPr>
-        <w:rPr>
-          <w:sz w:val="12"/>
-          <w:szCs w:val="20"/>
-        </w:rPr>
-      </w:pPr>
-      <w:r>
-        <w:rPr>
-          <w:sz w:val="20"/>
-          <w:szCs w:val="20"/>
-        </w:rPr>
-        <w:t>src/main/java/.../</w:t>
-      </w:r>
-      <w:r>
-        <w:rPr>
-          <w:sz w:val="20"/>
-          <w:szCs w:val="20"/>
-        </w:rPr>
-        <w:br/>
-      </w:r>
-      <w:r>
-        <w:rPr>
-          <w:rFonts w:ascii="MS Gothic" w:eastAsia="MS Gothic" w:hAnsi="MS Gothic" w:cs="MS Gothic" w:hint="eastAsia"/>
-          <w:sz w:val="20"/>
-          <w:szCs w:val="20"/>
-        </w:rPr>
-        <w:t>├</w:t>
-      </w:r>
-      <w:r>
-        <w:rPr>
-          <w:rFonts w:cs="Aptos"/>
-          <w:sz w:val="20"/>
-          <w:szCs w:val="20"/>
-        </w:rPr>
-        <w:t>──</w:t>
-      </w:r>
-      <w:r>
-        <w:rPr>
-          <w:sz w:val="20"/>
-          <w:szCs w:val="20"/>
-        </w:rPr>
-        <w:t xml:space="preserve"> controller/</w:t>
-      </w:r>
-      <w:r>
-        <w:rPr>
-          <w:sz w:val="20"/>
-          <w:szCs w:val="20"/>
-        </w:rPr>
-        <w:br/>
-      </w:r>
-      <w:r>
-        <w:rPr>
-          <w:rFonts w:ascii="MS Gothic" w:eastAsia="MS Gothic" w:hAnsi="MS Gothic" w:cs="MS Gothic" w:hint="eastAsia"/>
-          <w:sz w:val="20"/>
-          <w:szCs w:val="20"/>
-        </w:rPr>
-        <w:t>├</w:t>
-      </w:r>
-      <w:r>
-        <w:rPr>
-          <w:rFonts w:cs="Aptos"/>
-          <w:sz w:val="20"/>
-          <w:szCs w:val="20"/>
-        </w:rPr>
-        <w:t>──</w:t>
-      </w:r>
-      <w:r>
-        <w:rPr>
-          <w:sz w:val="20"/>
-          <w:szCs w:val="20"/>
-        </w:rPr>
-        <w:t xml:space="preserve"> service/</w:t>
-      </w:r>
-      <w:r>
-        <w:rPr>
-          <w:sz w:val="20"/>
-          <w:szCs w:val="20"/>
-        </w:rPr>
-        <w:br/>
-      </w:r>
-      <w:r>
-        <w:rPr>
-          <w:rFonts w:ascii="MS Gothic" w:eastAsia="MS Gothic" w:hAnsi="MS Gothic" w:cs="MS Gothic" w:hint="eastAsia"/>
-          <w:sz w:val="20"/>
-          <w:szCs w:val="20"/>
-        </w:rPr>
-        <w:t>├</w:t>
-      </w:r>
-      <w:r>
-        <w:rPr>
-          <w:rFonts w:cs="Aptos"/>
-          <w:sz w:val="20"/>
-          <w:szCs w:val="20"/>
-        </w:rPr>
-        <w:t>──</w:t>
-      </w:r>
-      <w:r>
-        <w:rPr>
-          <w:sz w:val="20"/>
-          <w:szCs w:val="20"/>
-        </w:rPr>
-        <w:t xml:space="preserve"> repository/</w:t>
-      </w:r>
-      <w:r>
-        <w:rPr>
-          <w:sz w:val="20"/>
-          <w:szCs w:val="20"/>
-        </w:rPr>
-        <w:br/>
-      </w:r>
-      <w:r>
-        <w:rPr>
-          <w:rFonts w:ascii="MS Gothic" w:eastAsia="MS Gothic" w:hAnsi="MS Gothic" w:cs="MS Gothic" w:hint="eastAsia"/>
-          <w:sz w:val="20"/>
-          <w:szCs w:val="20"/>
-        </w:rPr>
-        <w:t>├</w:t>
-      </w:r>
-      <w:r>
-        <w:rPr>
-          <w:rFonts w:cs="Aptos"/>
-          <w:sz w:val="20"/>
-          <w:szCs w:val="20"/>
-        </w:rPr>
-        <w:t>──</w:t>
-      </w:r>
-      <w:r>
-        <w:rPr>
-          <w:sz w:val="20"/>
-          <w:szCs w:val="20"/>
-        </w:rPr>
-        <w:t xml:space="preserve"> model/ (o entity/)</w:t>
-      </w:r>
-      <w:r>
-        <w:rPr>
-          <w:sz w:val="20"/>
-          <w:szCs w:val="20"/>
-        </w:rPr>
-        <w:br/>
-      </w:r>
-      <w:r>
-        <w:rPr>
-          <w:rFonts w:ascii="MS Gothic" w:eastAsia="MS Gothic" w:hAnsi="MS Gothic" w:cs="MS Gothic" w:hint="eastAsia"/>
-          <w:sz w:val="20"/>
-          <w:szCs w:val="20"/>
-        </w:rPr>
-        <w:t>├</w:t>
-      </w:r>
-      <w:r>
-        <w:rPr>
-          <w:rFonts w:cs="Aptos"/>
-          <w:sz w:val="20"/>
-          <w:szCs w:val="20"/>
-        </w:rPr>
-        <w:t>──</w:t>
-      </w:r>
-      <w:r>
-        <w:rPr>
-          <w:sz w:val="20"/>
-          <w:szCs w:val="20"/>
-        </w:rPr>
-        <w:t xml:space="preserve"> dto/</w:t>
-      </w:r>
-      <w:r>
-        <w:rPr>
-          <w:sz w:val="20"/>
-          <w:szCs w:val="20"/>
-        </w:rPr>
-        <w:br/>
-      </w:r>
-      <w:r>
-        <w:rPr>
-          <w:rFonts w:ascii="MS Gothic" w:eastAsia="MS Gothic" w:hAnsi="MS Gothic" w:cs="MS Gothic" w:hint="eastAsia"/>
-          <w:sz w:val="20"/>
-          <w:szCs w:val="20"/>
-        </w:rPr>
-        <w:t>├</w:t>
-      </w:r>
-      <w:r>
-        <w:rPr>
-          <w:rFonts w:cs="Aptos"/>
-          <w:sz w:val="20"/>
-          <w:szCs w:val="20"/>
-        </w:rPr>
-        <w:t>──</w:t>
-      </w:r>
-      <w:r>
-        <w:rPr>
-          <w:sz w:val="20"/>
-          <w:szCs w:val="20"/>
-        </w:rPr>
-        <w:t xml:space="preserve"> exception/</w:t>
-      </w:r>
-      <w:r>
-        <w:rPr>
-          <w:sz w:val="20"/>
-          <w:szCs w:val="20"/>
-        </w:rPr>
-        <w:br/>
-      </w:r>
-      <w:r>
-        <w:rPr>
-          <w:rFonts w:ascii="MS Gothic" w:eastAsia="MS Gothic" w:hAnsi="MS Gothic" w:cs="MS Gothic" w:hint="eastAsia"/>
-          <w:sz w:val="20"/>
-          <w:szCs w:val="20"/>
-        </w:rPr>
-        <w:t>├</w:t>
-      </w:r>
-      <w:r>
-        <w:rPr>
-          <w:rFonts w:cs="Aptos"/>
-          <w:sz w:val="20"/>
-          <w:szCs w:val="20"/>
-        </w:rPr>
-        <w:t>──</w:t>
-      </w:r>
-      <w:r>
-        <w:rPr>
-          <w:sz w:val="20"/>
-          <w:szCs w:val="20"/>
-        </w:rPr>
-        <w:t xml:space="preserve"> config/</w:t>
-      </w:r>
-      <w:r>
-        <w:rPr>
-          <w:sz w:val="20"/>
-          <w:szCs w:val="20"/>
-        </w:rPr>
-        <w:br/>
-        <w:t>└── client/       ← llamadas a otros microservicios cuando corresponda</w:t>
-      </w:r>
-    </w:p>
-    <w:p>
-      <w:pPr>
-        <w:rPr>
-          <w:sz w:val="20"/>
-          <w:szCs w:val="20"/>
-        </w:rPr>
-      </w:pPr>
-      <w:r>
-        <w:rPr>
-          <w:sz w:val="20"/>
-          <w:szCs w:val="20"/>
-        </w:rPr>
-        <w:t xml:space="preserve">Dentro de un mismo microservicio se pueden separar paquetes por subdominio. Por ejemplo, Productos e Inventario puede organizar internamente producto, </w:t>
-      </w:r>
-      <w:r>
-        <w:rPr>
-          <w:sz w:val="20"/>
-          <w:szCs w:val="20"/>
-        </w:rPr>
-        <w:t>categoría</w:t>
-      </w:r>
-      <w:r>
-        <w:rPr>
-          <w:sz w:val="20"/>
-          <w:szCs w:val="20"/>
-        </w:rPr>
-        <w:t xml:space="preserve">, stock, movimiento, ajuste e </w:t>
-      </w:r>
-      <w:r>
-        <w:rPr>
-          <w:sz w:val="20"/>
-          <w:szCs w:val="20"/>
-        </w:rPr>
-        <w:t>inventario físico</w:t>
-      </w:r>
-      <w:r>
-        <w:rPr>
-          <w:sz w:val="20"/>
-          <w:szCs w:val="20"/>
-        </w:rPr>
-        <w:t xml:space="preserve"> sin necesidad de crear un microservicio adicional.</w:t>
-      </w:r>
-    </w:p>
-    <w:p>
-      <w:pPr>
-        <w:pStyle w:val="Heading1"/>
-        <w:rPr>
-          <w:sz w:val="32"/>
-          <w:szCs w:val="32"/>
-        </w:rPr>
-      </w:pPr>
-      <w:r>
-        <w:rPr>
-          <w:sz w:val="32"/>
-          <w:szCs w:val="32"/>
-        </w:rPr>
-        <w:t xml:space="preserve">6. </w:t>
-      </w:r>
-      <w:r>
-        <w:rPr>
-          <w:sz w:val="32"/>
-          <w:szCs w:val="32"/>
-        </w:rPr>
-        <w:t>Próximos pasos</w:t>
-      </w:r>
-    </w:p>
-    <w:p>
-      <w:pPr>
-        <w:rPr>
-          <w:sz w:val="20"/>
-          <w:szCs w:val="20"/>
-        </w:rPr>
-      </w:pPr>
-      <w:r>
-        <w:rPr>
-          <w:sz w:val="20"/>
-          <w:szCs w:val="20"/>
-        </w:rPr>
-        <w:t>1. Definir entidades y tablas de cada uno de los seis microservicios.</w:t>
-      </w:r>
-    </w:p>
-    <w:p>
-      <w:pPr>
-        <w:rPr>
-          <w:sz w:val="20"/>
-          <w:szCs w:val="20"/>
-        </w:rPr>
-      </w:pPr>
-      <w:r>
-        <w:rPr>
-          <w:sz w:val="20"/>
-          <w:szCs w:val="20"/>
-        </w:rPr>
-        <w:t>2. Definir relaciones internas y referencias entre servicios.</w:t>
-      </w:r>
-    </w:p>
-    <w:p>
-      <w:pPr>
-        <w:rPr>
-          <w:sz w:val="20"/>
-          <w:szCs w:val="20"/>
-        </w:rPr>
-      </w:pPr>
-      <w:r>
-        <w:t>3. Endpoints REST oficiales implementados y documentados en OpenAPI 3.0 / Swagger en cada puerto:</w:t>
-        <w:br/>
-        <w:t xml:space="preserve">   • 8081 Auth: POST /api/auth/login, POST /api/usuarios, PUT /api/usuarios/{id}/password, PUT /api/usuarios/{id}/inactivar</w:t>
-        <w:br/>
-        <w:t xml:space="preserve">   • 8082 Alumnos: GET/POST /api/alumnos, POST /api/saldos/{id}/abonar, POST /api/saldos/{id}/comprometer, POST /api/saldos/{id}/finalizar-reserva</w:t>
-        <w:br/>
-        <w:t xml:space="preserve">   • 8083 Productos: GET/POST /api/productos, POST /api/inventario/{id}/reservar, POST /api/inventario/{id}/descontar, POST /api/inventario/{id}/entrada-compra, POST/PUT /api/inventario/ajustes/**</w:t>
-        <w:br/>
-        <w:t xml:space="preserve">   • 8084 Ventas: POST /api/reservas, PUT /api/reservas/{id}/iniciar-preparacion, PUT /api/reservas/{id}/etiquetar, POST /api/reservas/{id}/entregar, POST /api/ventas/directa</w:t>
-        <w:br/>
-        <w:t xml:space="preserve">   • 8085 Compras: GET/POST /api/proveedores, POST /api/ordenes-compra, POST /api/recepciones (Variante B atómica), PUT /api/recepciones/facturas/{id}/marcar-pagada</w:t>
-        <w:br/>
-        <w:t xml:space="preserve">   • 8086 Finanzas: GET/POST /api/finanzas/caja/** (HU58), POST /api/finanzas/resultados/operacion, POST/PUT /api/finanzas/pagos/** (doble firma), POST /api/periodos/abrir</w:t>
+        <w:rPr>
+          <w:sz w:val="20"/>
+          <w:szCs w:val="20"/>
+        </w:rPr>
+      </w:pPr>
+      <w:r>
+        <w:rPr>
+          <w:sz w:val="20"/>
+          <w:szCs w:val="20"/>
+        </w:rPr>
+        <w:t>3. Definir endpoints REST necesarios para reproducir los procesos del prototip</w:t>
+      </w:r>
+      <w:r>
+        <w:rPr>
+          <w:sz w:val="20"/>
+          <w:szCs w:val="20"/>
+        </w:rPr>
+        <w:t>o</w:t>
+      </w:r>
+      <w:r>
+        <w:rPr>
+          <w:sz w:val="20"/>
+          <w:szCs w:val="20"/>
+        </w:rPr>
+        <w:t>.</w:t>
       </w:r>
     </w:p>
     <w:p>

</xml_diff>